<commit_message>
Backup auto 2025-09-28 16:39:36
</commit_message>
<xml_diff>
--- a/ZZ échanges ChatGpt Gemini/00000 prompt pour  Doc État du Projet.docx
+++ b/ZZ échanges ChatGpt Gemini/00000 prompt pour  Doc État du Projet.docx
@@ -943,16 +943,38 @@
         <w:rPr>
           <w:bCs/>
         </w:rPr>
-        <w:t xml:space="preserve">   - Gabarits emails, `</w:t>
+        <w:t xml:space="preserve">   - Gabarits </w:t>
+      </w:r>
+      <w:proofErr w:type="gramStart"/>
+      <w:r>
+        <w:rPr>
+          <w:bCs/>
+        </w:rPr>
+        <w:t>emails</w:t>
+      </w:r>
+      <w:proofErr w:type="gramEnd"/>
+      <w:r>
+        <w:rPr>
+          <w:bCs/>
+        </w:rPr>
+        <w:t>, `</w:t>
       </w:r>
       <w:proofErr w:type="spellStart"/>
       <w:r>
         <w:rPr>
           <w:bCs/>
         </w:rPr>
-        <w:t>sys_Composition_Emails</w:t>
+        <w:t>sys_Composition_</w:t>
+      </w:r>
+      <w:proofErr w:type="gramStart"/>
+      <w:r>
+        <w:rPr>
+          <w:bCs/>
+        </w:rPr>
+        <w:t>Emails</w:t>
       </w:r>
       <w:proofErr w:type="spellEnd"/>
+      <w:proofErr w:type="gramEnd"/>
       <w:r>
         <w:rPr>
           <w:bCs/>
@@ -1343,7 +1365,21 @@
         <w:rPr>
           <w:bCs/>
         </w:rPr>
-        <w:t xml:space="preserve"> d’emails).</w:t>
+        <w:t xml:space="preserve"> </w:t>
+      </w:r>
+      <w:proofErr w:type="gramStart"/>
+      <w:r>
+        <w:rPr>
+          <w:bCs/>
+        </w:rPr>
+        <w:t>d’emails</w:t>
+      </w:r>
+      <w:proofErr w:type="gramEnd"/>
+      <w:r>
+        <w:rPr>
+          <w:bCs/>
+        </w:rPr>
+        <w:t>).</w:t>
       </w:r>
     </w:p>
     <w:p>
@@ -1363,7 +1399,21 @@
         <w:rPr>
           <w:bCs/>
         </w:rPr>
-        <w:t>ID_Gabarit_Email_Repondant</w:t>
+        <w:t>ID_Gabarit_</w:t>
+      </w:r>
+      <w:proofErr w:type="gramStart"/>
+      <w:r>
+        <w:rPr>
+          <w:bCs/>
+        </w:rPr>
+        <w:t>Email</w:t>
+      </w:r>
+      <w:proofErr w:type="gramEnd"/>
+      <w:r>
+        <w:rPr>
+          <w:bCs/>
+        </w:rPr>
+        <w:t>_Repondant</w:t>
       </w:r>
       <w:proofErr w:type="spellEnd"/>
       <w:r>
@@ -1600,21 +1650,57 @@
         <w:rPr>
           <w:bCs/>
         </w:rPr>
-        <w:t xml:space="preserve"> d’e-mail `{{...}}`, noter la **source** (gabarit Doc/`</w:t>
+        <w:t xml:space="preserve"> </w:t>
+      </w:r>
+      <w:proofErr w:type="gramStart"/>
+      <w:r>
+        <w:rPr>
+          <w:bCs/>
+        </w:rPr>
+        <w:t>d’e-mail</w:t>
+      </w:r>
+      <w:proofErr w:type="gramEnd"/>
+      <w:r>
+        <w:rPr>
+          <w:bCs/>
+        </w:rPr>
+        <w:t xml:space="preserve"> `{{...}}`, noter la **source** (gabarit Doc/`</w:t>
       </w:r>
       <w:proofErr w:type="spellStart"/>
       <w:r>
         <w:rPr>
           <w:bCs/>
         </w:rPr>
-        <w:t>sys_Composition_Emails</w:t>
+        <w:t>sys_Composition_</w:t>
+      </w:r>
+      <w:proofErr w:type="gramStart"/>
+      <w:r>
+        <w:rPr>
+          <w:bCs/>
+        </w:rPr>
+        <w:t>Emails</w:t>
       </w:r>
       <w:proofErr w:type="spellEnd"/>
+      <w:proofErr w:type="gramEnd"/>
       <w:r>
         <w:rPr>
           <w:bCs/>
         </w:rPr>
-        <w:t>`) et la **valeur de substitution** (ex: clé dans `</w:t>
+        <w:t xml:space="preserve">`) et </w:t>
+      </w:r>
+      <w:proofErr w:type="gramStart"/>
+      <w:r>
+        <w:rPr>
+          <w:bCs/>
+        </w:rPr>
+        <w:t>la</w:t>
+      </w:r>
+      <w:proofErr w:type="gramEnd"/>
+      <w:r>
+        <w:rPr>
+          <w:bCs/>
+        </w:rPr>
+        <w:t xml:space="preserve"> **valeur de substitution** (ex: clé dans `</w:t>
       </w:r>
       <w:proofErr w:type="spellStart"/>
       <w:r>
@@ -1766,13 +1852,27 @@
         <w:rPr>
           <w:bCs/>
         </w:rPr>
-        <w:t xml:space="preserve">en début </w:t>
+        <w:t xml:space="preserve">en </w:t>
+      </w:r>
+      <w:proofErr w:type="gramStart"/>
+      <w:r>
+        <w:rPr>
+          <w:bCs/>
+        </w:rPr>
+        <w:t xml:space="preserve">début </w:t>
       </w:r>
       <w:r>
         <w:rPr>
           <w:bCs/>
         </w:rPr>
-        <w:t xml:space="preserve"> du document : rappel pour la session suivante les consignes</w:t>
+        <w:t xml:space="preserve"> du</w:t>
+      </w:r>
+      <w:proofErr w:type="gramEnd"/>
+      <w:r>
+        <w:rPr>
+          <w:bCs/>
+        </w:rPr>
+        <w:t xml:space="preserve"> document : rappel pour la session les consignes</w:t>
       </w:r>
       <w:r>
         <w:rPr>
@@ -1829,22 +1929,129 @@
     <w:p>
       <w:pPr>
         <w:rPr>
-          <w:b/>
-          <w:bCs/>
-          <w:lang w:val="fr-FR"/>
+          <w:bCs/>
         </w:rPr>
       </w:pPr>
       <w:r>
         <w:rPr>
           <w:bCs/>
         </w:rPr>
-        <w:t>les consignes impératives</w:t>
+        <w:t xml:space="preserve">Commence le document par la phrase : </w:t>
+      </w:r>
+    </w:p>
+    <w:p>
+      <w:pPr>
+        <w:rPr>
+          <w:bCs/>
+        </w:rPr>
+      </w:pPr>
+      <w:r>
+        <w:rPr>
+          <w:bCs/>
+        </w:rPr>
+        <w:t>« </w:t>
       </w:r>
       <w:r>
         <w:rPr>
-          <w:bCs/>
-        </w:rPr>
-        <w:t> :</w:t>
+          <w:lang w:val="fr-FR"/>
+        </w:rPr>
+        <w:t xml:space="preserve">Reprendre connaissance du dossier** : </w:t>
+      </w:r>
+      <w:r>
+        <w:rPr>
+          <w:lang w:val="fr-FR"/>
+        </w:rPr>
+        <w:t xml:space="preserve">à partir des documents fournis , </w:t>
+      </w:r>
+      <w:r>
+        <w:rPr>
+          <w:lang w:val="fr-FR"/>
+        </w:rPr>
+        <w:t>Les scripts et fichiers de l'application sont connus</w:t>
+      </w:r>
+      <w:r>
+        <w:rPr>
+          <w:lang w:val="fr-FR"/>
+        </w:rPr>
+        <w:t xml:space="preserve">, </w:t>
+      </w:r>
+      <w:proofErr w:type="gramStart"/>
+      <w:r>
+        <w:rPr>
+          <w:lang w:val="fr-FR"/>
+        </w:rPr>
+        <w:t>demande les</w:t>
+      </w:r>
+      <w:proofErr w:type="gramEnd"/>
+      <w:r>
+        <w:rPr>
+          <w:lang w:val="fr-FR"/>
+        </w:rPr>
+        <w:t xml:space="preserve"> si </w:t>
+      </w:r>
+      <w:r>
+        <w:rPr>
+          <w:lang w:val="fr-FR"/>
+        </w:rPr>
+        <w:t>nécessaire</w:t>
+      </w:r>
+      <w:r>
+        <w:rPr>
+          <w:bCs/>
+        </w:rPr>
+        <w:t> »</w:t>
+      </w:r>
+    </w:p>
+    <w:p>
+      <w:pPr>
+        <w:rPr>
+          <w:bCs/>
+        </w:rPr>
+      </w:pPr>
+      <w:r>
+        <w:rPr>
+          <w:bCs/>
+        </w:rPr>
+        <w:t xml:space="preserve">Puis les phrases : </w:t>
+      </w:r>
+    </w:p>
+    <w:p>
+      <w:pPr>
+        <w:rPr>
+          <w:b/>
+          <w:bCs/>
+          <w:lang w:val="fr-FR"/>
+        </w:rPr>
+      </w:pPr>
+      <w:r>
+        <w:rPr>
+          <w:bCs/>
+        </w:rPr>
+        <w:t>« </w:t>
+      </w:r>
+      <w:r>
+        <w:rPr>
+          <w:bCs/>
+        </w:rPr>
+        <w:t>Les</w:t>
+      </w:r>
+      <w:r>
+        <w:rPr>
+          <w:bCs/>
+        </w:rPr>
+        <w:t xml:space="preserve"> consignes impératives</w:t>
+      </w:r>
+      <w:r>
+        <w:rPr>
+          <w:bCs/>
+        </w:rPr>
+        <w:t xml:space="preserve"> pour cette session</w:t>
+      </w:r>
+      <w:r>
+        <w:rPr>
+          <w:bCs/>
+        </w:rPr>
+        <w:t>:</w:t>
       </w:r>
     </w:p>
     <w:p>
@@ -1900,7 +2107,21 @@
         <w:rPr>
           <w:lang w:val="fr-FR"/>
         </w:rPr>
-        <w:t xml:space="preserve"> (non programmeur).</w:t>
+        <w:t xml:space="preserve"> (</w:t>
+      </w:r>
+      <w:proofErr w:type="gramStart"/>
+      <w:r>
+        <w:rPr>
+          <w:lang w:val="fr-FR"/>
+        </w:rPr>
+        <w:t>non programmeur</w:t>
+      </w:r>
+      <w:proofErr w:type="gramEnd"/>
+      <w:r>
+        <w:rPr>
+          <w:lang w:val="fr-FR"/>
+        </w:rPr>
+        <w:t>).</w:t>
       </w:r>
     </w:p>
     <w:p>
@@ -1933,6 +2154,12 @@
         </w:rPr>
         <w:t xml:space="preserve"> (juste le nom, pas le détail).</w:t>
       </w:r>
+      <w:r>
+        <w:rPr>
+          <w:lang w:val="fr-FR"/>
+        </w:rPr>
+        <w:t> »</w:t>
+      </w:r>
     </w:p>
     <w:p>
       <w:pPr>
@@ -1975,7 +2202,21 @@
         <w:rPr>
           <w:lang w:val="fr-FR"/>
         </w:rPr>
-        <w:t>piloté par les données : questionnaires → calculs (r/K + génériques) → recommandations → e-mails + PDF multilingues → (paiement optionnel).</w:t>
+        <w:t xml:space="preserve">piloté par les données : questionnaires → calculs (r/K + génériques) → recommandations → </w:t>
+      </w:r>
+      <w:proofErr w:type="gramStart"/>
+      <w:r>
+        <w:rPr>
+          <w:lang w:val="fr-FR"/>
+        </w:rPr>
+        <w:t>e-mails</w:t>
+      </w:r>
+      <w:proofErr w:type="gramEnd"/>
+      <w:r>
+        <w:rPr>
+          <w:lang w:val="fr-FR"/>
+        </w:rPr>
+        <w:t xml:space="preserve"> + PDF multilingues → (paiement optionnel).</w:t>
       </w:r>
     </w:p>
     <w:p>
@@ -28005,6 +28246,7 @@
   <w:style w:type="character" w:default="1" w:styleId="Policepardfaut">
     <w:name w:val="Default Paragraph Font"/>
     <w:uiPriority w:val="1"/>
+    <w:semiHidden/>
     <w:unhideWhenUsed/>
   </w:style>
   <w:style w:type="table" w:default="1" w:styleId="TableauNormal">

</xml_diff>

<commit_message>
Backup auto 2025-09-29 09:12:19
</commit_message>
<xml_diff>
--- a/ZZ échanges ChatGpt Gemini/00000 prompt pour  Doc État du Projet.docx
+++ b/ZZ échanges ChatGpt Gemini/00000 prompt pour  Doc État du Projet.docx
@@ -1987,13 +1987,7 @@
         <w:rPr>
           <w:lang w:val="fr-FR"/>
         </w:rPr>
-        <w:t xml:space="preserve"> si </w:t>
-      </w:r>
-      <w:r>
-        <w:rPr>
-          <w:lang w:val="fr-FR"/>
-        </w:rPr>
-        <w:t>nécessaire</w:t>
+        <w:t xml:space="preserve"> si nécessaire</w:t>
       </w:r>
       <w:r>
         <w:rPr>
@@ -2225,6 +2219,100 @@
           <w:bCs/>
         </w:rPr>
       </w:pPr>
+      <w:r>
+        <w:rPr>
+          <w:bCs/>
+        </w:rPr>
+        <w:t xml:space="preserve">Autre remarque : </w:t>
+      </w:r>
+      <w:r>
+        <w:rPr>
+          <w:bCs/>
+        </w:rPr>
+        <w:t xml:space="preserve">liste </w:t>
+      </w:r>
+      <w:proofErr w:type="gramStart"/>
+      <w:r>
+        <w:rPr>
+          <w:bCs/>
+        </w:rPr>
+        <w:t xml:space="preserve">également  </w:t>
+      </w:r>
+      <w:r>
+        <w:rPr>
+          <w:bCs/>
+        </w:rPr>
+        <w:t>dans</w:t>
+      </w:r>
+      <w:proofErr w:type="gramEnd"/>
+      <w:r>
+        <w:rPr>
+          <w:bCs/>
+        </w:rPr>
+        <w:t xml:space="preserve"> ce document </w:t>
+      </w:r>
+      <w:r>
+        <w:rPr>
+          <w:bCs/>
+        </w:rPr>
+        <w:t xml:space="preserve">les modifications / </w:t>
+      </w:r>
+      <w:proofErr w:type="gramStart"/>
+      <w:r>
+        <w:rPr>
+          <w:bCs/>
+        </w:rPr>
+        <w:t>développements  futurs</w:t>
+      </w:r>
+      <w:proofErr w:type="gramEnd"/>
+      <w:r>
+        <w:rPr>
+          <w:bCs/>
+        </w:rPr>
+        <w:t xml:space="preserve">  dans le cadre du cahier des charges que nous faisons </w:t>
+      </w:r>
+      <w:proofErr w:type="gramStart"/>
+      <w:r>
+        <w:rPr>
+          <w:bCs/>
+        </w:rPr>
+        <w:t>évoluer  en</w:t>
+      </w:r>
+      <w:proofErr w:type="gramEnd"/>
+      <w:r>
+        <w:rPr>
+          <w:bCs/>
+        </w:rPr>
+        <w:t xml:space="preserve"> continu , de façon à </w:t>
+      </w:r>
+      <w:proofErr w:type="gramStart"/>
+      <w:r>
+        <w:rPr>
+          <w:bCs/>
+        </w:rPr>
+        <w:t>garder  également</w:t>
+      </w:r>
+      <w:proofErr w:type="gramEnd"/>
+      <w:r>
+        <w:rPr>
+          <w:bCs/>
+        </w:rPr>
+        <w:t xml:space="preserve">  le fil des </w:t>
+      </w:r>
+      <w:proofErr w:type="gramStart"/>
+      <w:r>
+        <w:rPr>
+          <w:bCs/>
+        </w:rPr>
+        <w:t>développements  à</w:t>
+      </w:r>
+      <w:proofErr w:type="gramEnd"/>
+      <w:r>
+        <w:rPr>
+          <w:bCs/>
+        </w:rPr>
+        <w:t xml:space="preserve"> long terme.</w:t>
+      </w:r>
     </w:p>
     <w:sectPr>
       <w:pgSz w:w="11906" w:h="16838"/>

</xml_diff>

<commit_message>
Backup auto 2025-09-30 06:05:20
</commit_message>
<xml_diff>
--- a/ZZ échanges ChatGpt Gemini/00000 prompt pour  Doc État du Projet.docx
+++ b/ZZ échanges ChatGpt Gemini/00000 prompt pour  Doc État du Projet.docx
@@ -2,6 +2,23 @@
 <file path=word/document.xml><?xml version="1.0" encoding="utf-8"?>
 <w:document xmlns:wpc="http://schemas.microsoft.com/office/word/2010/wordprocessingCanvas" xmlns:cx="http://schemas.microsoft.com/office/drawing/2014/chartex" xmlns:cx1="http://schemas.microsoft.com/office/drawing/2015/9/8/chartex" xmlns:cx2="http://schemas.microsoft.com/office/drawing/2015/10/21/chartex" xmlns:cx3="http://schemas.microsoft.com/office/drawing/2016/5/9/chartex" xmlns:cx4="http://schemas.microsoft.com/office/drawing/2016/5/10/chartex" xmlns:cx5="http://schemas.microsoft.com/office/drawing/2016/5/11/chartex" xmlns:cx6="http://schemas.microsoft.com/office/drawing/2016/5/12/chartex" xmlns:cx7="http://schemas.microsoft.com/office/drawing/2016/5/13/chartex" xmlns:cx8="http://schemas.microsoft.com/office/drawing/2016/5/14/chartex" xmlns:mc="http://schemas.openxmlformats.org/markup-compatibility/2006" xmlns:aink="http://schemas.microsoft.com/office/drawing/2016/ink" xmlns:am3d="http://schemas.microsoft.com/office/drawing/2017/model3d" xmlns:o="urn:schemas-microsoft-com:office:office" xmlns:oel="http://schemas.microsoft.com/office/2019/extlst" xmlns:r="http://schemas.openxmlformats.org/officeDocument/2006/relationships" xmlns:m="http://schemas.openxmlformats.org/officeDocument/2006/math" xmlns:v="urn:schemas-microsoft-com:vml" xmlns:wp14="http://schemas.microsoft.com/office/word/2010/wordprocessingDrawing" xmlns:wp="http://schemas.openxmlformats.org/drawingml/2006/wordprocessingDrawing" xmlns:w10="urn:schemas-microsoft-com:office:word" xmlns:w="http://schemas.openxmlformats.org/wordprocessingml/2006/main" xmlns:w14="http://schemas.microsoft.com/office/word/2010/wordml" xmlns:w15="http://schemas.microsoft.com/office/word/2012/wordml" xmlns:w16cex="http://schemas.microsoft.com/office/word/2018/wordml/cex" xmlns:w16cid="http://schemas.microsoft.com/office/word/2016/wordml/cid" xmlns:w16="http://schemas.microsoft.com/office/word/2018/wordml" xmlns:w16du="http://schemas.microsoft.com/office/word/2023/wordml/word16du" xmlns:w16sdtdh="http://schemas.microsoft.com/office/word/2020/wordml/sdtdatahash" xmlns:w16sdtfl="http://schemas.microsoft.com/office/word/2024/wordml/sdtformatlock" xmlns:w16se="http://schemas.microsoft.com/office/word/2015/wordml/symex" xmlns:wpg="http://schemas.microsoft.com/office/word/2010/wordprocessingGroup" xmlns:wpi="http://schemas.microsoft.com/office/word/2010/wordprocessingInk" xmlns:wne="http://schemas.microsoft.com/office/word/2006/wordml" xmlns:wps="http://schemas.microsoft.com/office/word/2010/wordprocessingShape" mc:Ignorable="w14 w15 w16se w16cid w16 w16cex w16sdtdh w16sdtfl w16du wp14">
   <w:body>
+    <w:p>
+      <w:pPr>
+        <w:rPr>
+          <w:b/>
+          <w:bCs/>
+          <w:lang w:val="fr-FR"/>
+        </w:rPr>
+      </w:pPr>
+      <w:r>
+        <w:rPr>
+          <w:b/>
+          <w:bCs/>
+          <w:lang w:val="fr-FR"/>
+        </w:rPr>
+        <w:t>Prompt final compact et enrichi</w:t>
+      </w:r>
+    </w:p>
     <w:p>
       <w:pPr>
         <w:rPr>
@@ -45,25 +62,7 @@
           <w:bCs/>
           <w:lang w:val="fr-FR"/>
         </w:rPr>
-        <w:t xml:space="preserve">document </w:t>
-      </w:r>
-      <w:proofErr w:type="spellStart"/>
-      <w:r>
-        <w:rPr>
-          <w:b/>
-          <w:bCs/>
-          <w:lang w:val="fr-FR"/>
-        </w:rPr>
-        <w:t>Markdown</w:t>
-      </w:r>
-      <w:proofErr w:type="spellEnd"/>
-      <w:r>
-        <w:rPr>
-          <w:b/>
-          <w:bCs/>
-          <w:lang w:val="fr-FR"/>
-        </w:rPr>
-        <w:t xml:space="preserve"> unique</w:t>
+        <w:t>document Markdown unique</w:t>
       </w:r>
       <w:r>
         <w:rPr>
@@ -191,8 +190,8 @@
           <w:bCs/>
           <w:lang w:val="fr-FR"/>
         </w:rPr>
-        <w:pict w14:anchorId="768F8BFC">
-          <v:rect id="_x0000_i1061" style="width:0;height:1.5pt" o:hralign="center" o:hrstd="t" o:hr="t" fillcolor="#a0a0a0" stroked="f"/>
+        <w:pict w14:anchorId="78130984">
+          <v:rect id="_x0000_i1025" style="width:0;height:1.5pt" o:hralign="center" o:hrstd="t" o:hr="t" fillcolor="#a0a0a0" stroked="f"/>
         </w:pict>
       </w:r>
     </w:p>
@@ -308,7 +307,21 @@
           <w:lang w:val="fr-FR"/>
         </w:rPr>
         <w:br/>
-        <w:t>• Une seule consigne à la fois, détaillée et concise.</w:t>
+        <w:t xml:space="preserve">• </w:t>
+      </w:r>
+      <w:r>
+        <w:rPr>
+          <w:bCs/>
+          <w:lang w:val="fr-FR"/>
+        </w:rPr>
+        <w:t xml:space="preserve">donne </w:t>
+      </w:r>
+      <w:r>
+        <w:rPr>
+          <w:bCs/>
+          <w:lang w:val="fr-FR"/>
+        </w:rPr>
+        <w:t>Une seule consigne à la fois, détaillée et concise.</w:t>
       </w:r>
       <w:r>
         <w:rPr>
@@ -355,8 +368,8 @@
           <w:bCs/>
           <w:lang w:val="fr-FR"/>
         </w:rPr>
-        <w:pict w14:anchorId="7BFA4BD0">
-          <v:rect id="_x0000_i1062" style="width:0;height:1.5pt" o:hralign="center" o:hrstd="t" o:hr="t" fillcolor="#a0a0a0" stroked="f"/>
+        <w:pict w14:anchorId="0D60F82E">
+          <v:rect id="_x0000_i1026" style="width:0;height:1.5pt" o:hralign="center" o:hrstd="t" o:hr="t" fillcolor="#a0a0a0" stroked="f"/>
         </w:pict>
       </w:r>
     </w:p>
@@ -381,7 +394,7 @@
       <w:pPr>
         <w:numPr>
           <w:ilvl w:val="0"/>
-          <w:numId w:val="191"/>
+          <w:numId w:val="195"/>
         </w:numPr>
         <w:rPr>
           <w:bCs/>
@@ -393,30 +406,52 @@
           <w:bCs/>
           <w:lang w:val="fr-FR"/>
         </w:rPr>
-        <w:t>Projet : {{</w:t>
+        <w:t>Projet : {{nom_du_projet}}</w:t>
       </w:r>
-      <w:proofErr w:type="spellStart"/>
+    </w:p>
+    <w:p>
+      <w:pPr>
+        <w:numPr>
+          <w:ilvl w:val="0"/>
+          <w:numId w:val="195"/>
+        </w:numPr>
+        <w:rPr>
+          <w:bCs/>
+          <w:lang w:val="fr-FR"/>
+        </w:rPr>
+      </w:pPr>
       <w:r>
         <w:rPr>
           <w:bCs/>
           <w:lang w:val="fr-FR"/>
         </w:rPr>
-        <w:t>nom_du_projet</w:t>
+        <w:t>Session : {{YYYY-MM-DD}} — {{tag_session}}</w:t>
       </w:r>
-      <w:proofErr w:type="spellEnd"/>
+    </w:p>
+    <w:p>
+      <w:pPr>
+        <w:numPr>
+          <w:ilvl w:val="0"/>
+          <w:numId w:val="195"/>
+        </w:numPr>
+        <w:rPr>
+          <w:bCs/>
+          <w:lang w:val="fr-FR"/>
+        </w:rPr>
+      </w:pPr>
       <w:r>
         <w:rPr>
           <w:bCs/>
           <w:lang w:val="fr-FR"/>
         </w:rPr>
-        <w:t>}}</w:t>
+        <w:t>Objectif global : {{objectif_global}}</w:t>
       </w:r>
     </w:p>
     <w:p>
       <w:pPr>
         <w:numPr>
           <w:ilvl w:val="0"/>
-          <w:numId w:val="191"/>
+          <w:numId w:val="195"/>
         </w:numPr>
         <w:rPr>
           <w:bCs/>
@@ -428,135 +463,33 @@
           <w:bCs/>
           <w:lang w:val="fr-FR"/>
         </w:rPr>
-        <w:t>Session : {{YYYY-MM-DD}} — {{</w:t>
+        <w:t>Focus de la session : {{focus_du_jour}}</w:t>
       </w:r>
-      <w:proofErr w:type="spellStart"/>
+    </w:p>
+    <w:p>
+      <w:pPr>
+        <w:numPr>
+          <w:ilvl w:val="0"/>
+          <w:numId w:val="195"/>
+        </w:numPr>
+        <w:rPr>
+          <w:bCs/>
+          <w:lang w:val="fr-FR"/>
+        </w:rPr>
+      </w:pPr>
       <w:r>
         <w:rPr>
           <w:bCs/>
           <w:lang w:val="fr-FR"/>
         </w:rPr>
-        <w:t>tag_session</w:t>
-      </w:r>
-      <w:proofErr w:type="spellEnd"/>
-      <w:r>
-        <w:rPr>
-          <w:bCs/>
-          <w:lang w:val="fr-FR"/>
-        </w:rPr>
-        <w:t>}}</w:t>
+        <w:t>Ligne CONFIG cible (si connue) : {{rowIndex}}</w:t>
       </w:r>
     </w:p>
     <w:p>
       <w:pPr>
         <w:numPr>
           <w:ilvl w:val="0"/>
-          <w:numId w:val="191"/>
-        </w:numPr>
-        <w:rPr>
-          <w:bCs/>
-          <w:lang w:val="fr-FR"/>
-        </w:rPr>
-      </w:pPr>
-      <w:r>
-        <w:rPr>
-          <w:bCs/>
-          <w:lang w:val="fr-FR"/>
-        </w:rPr>
-        <w:t>Objectif global : {{</w:t>
-      </w:r>
-      <w:proofErr w:type="spellStart"/>
-      <w:r>
-        <w:rPr>
-          <w:bCs/>
-          <w:lang w:val="fr-FR"/>
-        </w:rPr>
-        <w:t>objectif_global</w:t>
-      </w:r>
-      <w:proofErr w:type="spellEnd"/>
-      <w:r>
-        <w:rPr>
-          <w:bCs/>
-          <w:lang w:val="fr-FR"/>
-        </w:rPr>
-        <w:t>}}</w:t>
-      </w:r>
-    </w:p>
-    <w:p>
-      <w:pPr>
-        <w:numPr>
-          <w:ilvl w:val="0"/>
-          <w:numId w:val="191"/>
-        </w:numPr>
-        <w:rPr>
-          <w:bCs/>
-          <w:lang w:val="fr-FR"/>
-        </w:rPr>
-      </w:pPr>
-      <w:r>
-        <w:rPr>
-          <w:bCs/>
-          <w:lang w:val="fr-FR"/>
-        </w:rPr>
-        <w:t>Focus de la session : {{</w:t>
-      </w:r>
-      <w:proofErr w:type="spellStart"/>
-      <w:r>
-        <w:rPr>
-          <w:bCs/>
-          <w:lang w:val="fr-FR"/>
-        </w:rPr>
-        <w:t>focus_du_jour</w:t>
-      </w:r>
-      <w:proofErr w:type="spellEnd"/>
-      <w:r>
-        <w:rPr>
-          <w:bCs/>
-          <w:lang w:val="fr-FR"/>
-        </w:rPr>
-        <w:t>}}</w:t>
-      </w:r>
-    </w:p>
-    <w:p>
-      <w:pPr>
-        <w:numPr>
-          <w:ilvl w:val="0"/>
-          <w:numId w:val="191"/>
-        </w:numPr>
-        <w:rPr>
-          <w:bCs/>
-          <w:lang w:val="fr-FR"/>
-        </w:rPr>
-      </w:pPr>
-      <w:r>
-        <w:rPr>
-          <w:bCs/>
-          <w:lang w:val="fr-FR"/>
-        </w:rPr>
-        <w:t>Ligne CONFIG cible (si connue) : {{</w:t>
-      </w:r>
-      <w:proofErr w:type="spellStart"/>
-      <w:r>
-        <w:rPr>
-          <w:bCs/>
-          <w:lang w:val="fr-FR"/>
-        </w:rPr>
-        <w:t>rowIndex</w:t>
-      </w:r>
-      <w:proofErr w:type="spellEnd"/>
-      <w:r>
-        <w:rPr>
-          <w:bCs/>
-          <w:lang w:val="fr-FR"/>
-        </w:rPr>
-        <w:t>}}</w:t>
-      </w:r>
-    </w:p>
-    <w:p>
-      <w:pPr>
-        <w:numPr>
-          <w:ilvl w:val="0"/>
-          <w:numId w:val="191"/>
+          <w:numId w:val="195"/>
         </w:numPr>
         <w:rPr>
           <w:bCs/>
@@ -575,7 +508,7 @@
       <w:pPr>
         <w:numPr>
           <w:ilvl w:val="0"/>
-          <w:numId w:val="191"/>
+          <w:numId w:val="195"/>
         </w:numPr>
         <w:rPr>
           <w:bCs/>
@@ -587,39 +520,23 @@
           <w:bCs/>
           <w:lang w:val="fr-FR"/>
         </w:rPr>
-        <w:t xml:space="preserve">Contexte précédent : dernier </w:t>
+        <w:t>Contexte précédent : dernier Markdown à jour (si fourni) → puiser et fusionner Glossaire &amp; Registre.</w:t>
       </w:r>
-      <w:proofErr w:type="spellStart"/>
+    </w:p>
+    <w:p>
+      <w:pPr>
+        <w:rPr>
+          <w:bCs/>
+          <w:lang w:val="fr-FR"/>
+        </w:rPr>
+      </w:pPr>
       <w:r>
         <w:rPr>
           <w:bCs/>
           <w:lang w:val="fr-FR"/>
         </w:rPr>
-        <w:t>Markdown</w:t>
-      </w:r>
-      <w:proofErr w:type="spellEnd"/>
-      <w:r>
-        <w:rPr>
-          <w:bCs/>
-          <w:lang w:val="fr-FR"/>
-        </w:rPr>
-        <w:t xml:space="preserve"> à jour (si fourni) → puiser et fusionner Glossaire &amp; Registre.</w:t>
-      </w:r>
-    </w:p>
-    <w:p>
-      <w:pPr>
-        <w:rPr>
-          <w:bCs/>
-          <w:lang w:val="fr-FR"/>
-        </w:rPr>
-      </w:pPr>
-      <w:r>
-        <w:rPr>
-          <w:bCs/>
-          <w:lang w:val="fr-FR"/>
-        </w:rPr>
-        <w:pict w14:anchorId="4C3B61C6">
-          <v:rect id="_x0000_i1063" style="width:0;height:1.5pt" o:hralign="center" o:hrstd="t" o:hr="t" fillcolor="#a0a0a0" stroked="f"/>
+        <w:pict w14:anchorId="5C1DAD7D">
+          <v:rect id="_x0000_i1027" style="width:0;height:1.5pt" o:hralign="center" o:hrstd="t" o:hr="t" fillcolor="#a0a0a0" stroked="f"/>
         </w:pict>
       </w:r>
     </w:p>
@@ -644,7 +561,7 @@
       <w:pPr>
         <w:numPr>
           <w:ilvl w:val="0"/>
-          <w:numId w:val="192"/>
+          <w:numId w:val="196"/>
         </w:numPr>
         <w:rPr>
           <w:bCs/>
@@ -657,18 +574,8 @@
           <w:bCs/>
           <w:lang w:val="fr-FR"/>
         </w:rPr>
-        <w:t xml:space="preserve">Un seul fichier </w:t>
+        <w:t>Un seul fichier Markdown</w:t>
       </w:r>
-      <w:proofErr w:type="spellStart"/>
-      <w:r>
-        <w:rPr>
-          <w:b/>
-          <w:bCs/>
-          <w:lang w:val="fr-FR"/>
-        </w:rPr>
-        <w:t>Markdown</w:t>
-      </w:r>
-      <w:proofErr w:type="spellEnd"/>
       <w:r>
         <w:rPr>
           <w:bCs/>
@@ -681,7 +588,7 @@
       <w:pPr>
         <w:numPr>
           <w:ilvl w:val="0"/>
-          <w:numId w:val="192"/>
+          <w:numId w:val="196"/>
         </w:numPr>
         <w:rPr>
           <w:bCs/>
@@ -693,30 +600,14 @@
           <w:bCs/>
           <w:lang w:val="fr-FR"/>
         </w:rPr>
-        <w:t xml:space="preserve">Pas de texte hors </w:t>
-      </w:r>
-      <w:proofErr w:type="spellStart"/>
-      <w:r>
-        <w:rPr>
-          <w:bCs/>
-          <w:lang w:val="fr-FR"/>
-        </w:rPr>
-        <w:t>Markdown</w:t>
-      </w:r>
-      <w:proofErr w:type="spellEnd"/>
-      <w:r>
-        <w:rPr>
-          <w:bCs/>
-          <w:lang w:val="fr-FR"/>
-        </w:rPr>
-        <w:t>. Pas de questions.</w:t>
+        <w:t>Pas de texte hors Markdown. Pas de questions.</w:t>
       </w:r>
     </w:p>
     <w:p>
       <w:pPr>
         <w:numPr>
           <w:ilvl w:val="0"/>
-          <w:numId w:val="192"/>
+          <w:numId w:val="196"/>
         </w:numPr>
         <w:rPr>
           <w:bCs/>
@@ -735,7 +626,7 @@
       <w:pPr>
         <w:numPr>
           <w:ilvl w:val="0"/>
-          <w:numId w:val="192"/>
+          <w:numId w:val="196"/>
         </w:numPr>
         <w:rPr>
           <w:bCs/>
@@ -754,7 +645,7 @@
       <w:pPr>
         <w:numPr>
           <w:ilvl w:val="0"/>
-          <w:numId w:val="192"/>
+          <w:numId w:val="196"/>
         </w:numPr>
         <w:rPr>
           <w:bCs/>
@@ -773,26 +664,7 @@
       <w:pPr>
         <w:numPr>
           <w:ilvl w:val="0"/>
-          <w:numId w:val="192"/>
-        </w:numPr>
-        <w:rPr>
-          <w:bCs/>
-          <w:lang w:val="fr-FR"/>
-        </w:rPr>
-      </w:pPr>
-      <w:r>
-        <w:rPr>
-          <w:bCs/>
-          <w:lang w:val="fr-FR"/>
-        </w:rPr>
-        <w:t>Mettre en évidence les points bloquants/risqués.</w:t>
-      </w:r>
-    </w:p>
-    <w:p>
-      <w:pPr>
-        <w:numPr>
-          <w:ilvl w:val="0"/>
-          <w:numId w:val="192"/>
+          <w:numId w:val="196"/>
         </w:numPr>
         <w:rPr>
           <w:bCs/>
@@ -805,11 +677,15 @@
           <w:lang w:val="fr-FR"/>
         </w:rPr>
         <w:lastRenderedPageBreak/>
-        <w:t>Annexes persistantes : Glossaire et Registre → fusion, déduplication, tri, enrichissement.</w:t>
+        <w:t>Mettre en évidence les points bloquants/risqués.</w:t>
       </w:r>
     </w:p>
     <w:p>
       <w:pPr>
+        <w:numPr>
+          <w:ilvl w:val="0"/>
+          <w:numId w:val="196"/>
+        </w:numPr>
         <w:rPr>
           <w:bCs/>
           <w:lang w:val="fr-FR"/>
@@ -820,8 +696,23 @@
           <w:bCs/>
           <w:lang w:val="fr-FR"/>
         </w:rPr>
-        <w:pict w14:anchorId="1D22C279">
-          <v:rect id="_x0000_i1064" style="width:0;height:1.5pt" o:hralign="center" o:hrstd="t" o:hr="t" fillcolor="#a0a0a0" stroked="f"/>
+        <w:t>Annexes persistantes : Glossaire et Registre → fusion, déduplication, tri, enrichissement.</w:t>
+      </w:r>
+    </w:p>
+    <w:p>
+      <w:pPr>
+        <w:rPr>
+          <w:bCs/>
+          <w:lang w:val="fr-FR"/>
+        </w:rPr>
+      </w:pPr>
+      <w:r>
+        <w:rPr>
+          <w:bCs/>
+          <w:lang w:val="fr-FR"/>
+        </w:rPr>
+        <w:pict w14:anchorId="799577C3">
+          <v:rect id="_x0000_i1028" style="width:0;height:1.5pt" o:hralign="center" o:hrstd="t" o:hr="t" fillcolor="#a0a0a0" stroked="f"/>
         </w:pict>
       </w:r>
     </w:p>
@@ -846,7 +737,7 @@
       <w:pPr>
         <w:numPr>
           <w:ilvl w:val="0"/>
-          <w:numId w:val="193"/>
+          <w:numId w:val="197"/>
         </w:numPr>
         <w:rPr>
           <w:bCs/>
@@ -865,8 +756,85 @@
     <w:p>
       <w:pPr>
         <w:numPr>
+          <w:ilvl w:val="1"/>
+          <w:numId w:val="197"/>
+        </w:numPr>
+        <w:rPr>
+          <w:bCs/>
+          <w:lang w:val="fr-FR"/>
+        </w:rPr>
+      </w:pPr>
+      <w:r>
+        <w:rPr>
+          <w:bCs/>
+          <w:lang w:val="fr-FR"/>
+        </w:rPr>
+        <w:t>Date, tag, projet, auteur (assistant), versions connues.</w:t>
+      </w:r>
+    </w:p>
+    <w:p>
+      <w:pPr>
+        <w:numPr>
+          <w:ilvl w:val="1"/>
+          <w:numId w:val="197"/>
+        </w:numPr>
+        <w:rPr>
+          <w:bCs/>
+          <w:lang w:val="fr-FR"/>
+        </w:rPr>
+      </w:pPr>
+      <w:r>
+        <w:rPr>
+          <w:bCs/>
+          <w:lang w:val="fr-FR"/>
+        </w:rPr>
+        <w:t>Snapshot des IDs : CONFIG, BDD, TEMPLATE, Form, Sheet réponses, Docs gabarits PDF.</w:t>
+      </w:r>
+    </w:p>
+    <w:p>
+      <w:pPr>
+        <w:numPr>
           <w:ilvl w:val="0"/>
-          <w:numId w:val="193"/>
+          <w:numId w:val="197"/>
+        </w:numPr>
+        <w:rPr>
+          <w:bCs/>
+          <w:lang w:val="fr-FR"/>
+        </w:rPr>
+      </w:pPr>
+      <w:r>
+        <w:rPr>
+          <w:b/>
+          <w:bCs/>
+          <w:lang w:val="fr-FR"/>
+        </w:rPr>
+        <w:t>Résumé narratif (executive summary)</w:t>
+      </w:r>
+    </w:p>
+    <w:p>
+      <w:pPr>
+        <w:numPr>
+          <w:ilvl w:val="1"/>
+          <w:numId w:val="197"/>
+        </w:numPr>
+        <w:rPr>
+          <w:bCs/>
+          <w:lang w:val="fr-FR"/>
+        </w:rPr>
+      </w:pPr>
+      <w:r>
+        <w:rPr>
+          <w:bCs/>
+          <w:lang w:val="fr-FR"/>
+        </w:rPr>
+        <w:t>Synthèse en texte continu de ce qui a été fait, pourquoi, et où on en est.</w:t>
+      </w:r>
+    </w:p>
+    <w:p>
+      <w:pPr>
+        <w:numPr>
+          <w:ilvl w:val="0"/>
+          <w:numId w:val="197"/>
         </w:numPr>
         <w:rPr>
           <w:bCs/>
@@ -885,8 +853,46 @@
     <w:p>
       <w:pPr>
         <w:numPr>
+          <w:ilvl w:val="1"/>
+          <w:numId w:val="197"/>
+        </w:numPr>
+        <w:rPr>
+          <w:bCs/>
+          <w:lang w:val="fr-FR"/>
+        </w:rPr>
+      </w:pPr>
+      <w:r>
+        <w:rPr>
+          <w:bCs/>
+          <w:lang w:val="fr-FR"/>
+        </w:rPr>
+        <w:t>Avant → après, raison, impact, niveau de risque.</w:t>
+      </w:r>
+    </w:p>
+    <w:p>
+      <w:pPr>
+        <w:numPr>
+          <w:ilvl w:val="1"/>
+          <w:numId w:val="197"/>
+        </w:numPr>
+        <w:rPr>
+          <w:bCs/>
+          <w:lang w:val="fr-FR"/>
+        </w:rPr>
+      </w:pPr>
+      <w:r>
+        <w:rPr>
+          <w:bCs/>
+          <w:lang w:val="fr-FR"/>
+        </w:rPr>
+        <w:t>Créations/modifs de fichiers, menus, triggers, paramètres.</w:t>
+      </w:r>
+    </w:p>
+    <w:p>
+      <w:pPr>
+        <w:numPr>
           <w:ilvl w:val="0"/>
-          <w:numId w:val="193"/>
+          <w:numId w:val="197"/>
         </w:numPr>
         <w:rPr>
           <w:bCs/>
@@ -905,8 +911,27 @@
     <w:p>
       <w:pPr>
         <w:numPr>
+          <w:ilvl w:val="1"/>
+          <w:numId w:val="197"/>
+        </w:numPr>
+        <w:rPr>
+          <w:bCs/>
+          <w:lang w:val="fr-FR"/>
+        </w:rPr>
+      </w:pPr>
+      <w:r>
+        <w:rPr>
+          <w:bCs/>
+          <w:lang w:val="fr-FR"/>
+        </w:rPr>
+        <w:t>Décisions + alternatives écartées + critères.</w:t>
+      </w:r>
+    </w:p>
+    <w:p>
+      <w:pPr>
+        <w:numPr>
           <w:ilvl w:val="0"/>
-          <w:numId w:val="193"/>
+          <w:numId w:val="197"/>
         </w:numPr>
         <w:rPr>
           <w:bCs/>
@@ -925,8 +950,87 @@
     <w:p>
       <w:pPr>
         <w:numPr>
+          <w:ilvl w:val="1"/>
+          <w:numId w:val="197"/>
+        </w:numPr>
+        <w:rPr>
+          <w:bCs/>
+          <w:lang w:val="fr-FR"/>
+        </w:rPr>
+      </w:pPr>
+      <w:r>
+        <w:rPr>
+          <w:bCs/>
+          <w:lang w:val="fr-FR"/>
+        </w:rPr>
+        <w:t xml:space="preserve">Menus visibles </w:t>
+      </w:r>
+      <w:r>
+        <w:rPr>
+          <w:rFonts w:ascii="Segoe UI Symbol" w:hAnsi="Segoe UI Symbol" w:cs="Segoe UI Symbol"/>
+          <w:bCs/>
+          <w:lang w:val="fr-FR"/>
+        </w:rPr>
+        <w:t>✔</w:t>
+      </w:r>
+      <w:r>
+        <w:rPr>
+          <w:bCs/>
+          <w:lang w:val="fr-FR"/>
+        </w:rPr>
+        <w:t>/</w:t>
+      </w:r>
+      <w:r>
+        <w:rPr>
+          <w:rFonts w:ascii="Segoe UI Symbol" w:hAnsi="Segoe UI Symbol" w:cs="Segoe UI Symbol"/>
+          <w:bCs/>
+          <w:lang w:val="fr-FR"/>
+        </w:rPr>
+        <w:t>✖</w:t>
+      </w:r>
+      <w:r>
+        <w:rPr>
+          <w:bCs/>
+          <w:lang w:val="fr-FR"/>
+        </w:rPr>
+        <w:t xml:space="preserve">, triggers </w:t>
+      </w:r>
+      <w:r>
+        <w:rPr>
+          <w:rFonts w:ascii="Segoe UI Symbol" w:hAnsi="Segoe UI Symbol" w:cs="Segoe UI Symbol"/>
+          <w:bCs/>
+          <w:lang w:val="fr-FR"/>
+        </w:rPr>
+        <w:t>✔</w:t>
+      </w:r>
+      <w:r>
+        <w:rPr>
+          <w:bCs/>
+          <w:lang w:val="fr-FR"/>
+        </w:rPr>
+        <w:t>/</w:t>
+      </w:r>
+      <w:r>
+        <w:rPr>
+          <w:rFonts w:ascii="Segoe UI Symbol" w:hAnsi="Segoe UI Symbol" w:cs="Segoe UI Symbol"/>
+          <w:bCs/>
+          <w:lang w:val="fr-FR"/>
+        </w:rPr>
+        <w:t>✖</w:t>
+      </w:r>
+      <w:r>
+        <w:rPr>
+          <w:bCs/>
+          <w:lang w:val="fr-FR"/>
+        </w:rPr>
+        <w:t>, statut du test, lignes CONFIG pertinentes.</w:t>
+      </w:r>
+    </w:p>
+    <w:p>
+      <w:pPr>
+        <w:numPr>
           <w:ilvl w:val="0"/>
-          <w:numId w:val="193"/>
+          <w:numId w:val="197"/>
         </w:numPr>
         <w:rPr>
           <w:bCs/>
@@ -945,8 +1049,106 @@
     <w:p>
       <w:pPr>
         <w:numPr>
+          <w:ilvl w:val="1"/>
+          <w:numId w:val="197"/>
+        </w:numPr>
+        <w:rPr>
+          <w:bCs/>
+          <w:lang w:val="fr-FR"/>
+        </w:rPr>
+      </w:pPr>
+      <w:r>
+        <w:rPr>
+          <w:bCs/>
+          <w:lang w:val="fr-FR"/>
+        </w:rPr>
+        <w:t xml:space="preserve">Checklist </w:t>
+      </w:r>
+      <w:r>
+        <w:rPr>
+          <w:rFonts w:ascii="Segoe UI Symbol" w:hAnsi="Segoe UI Symbol" w:cs="Segoe UI Symbol"/>
+          <w:bCs/>
+          <w:lang w:val="fr-FR"/>
+        </w:rPr>
+        <w:t>✔</w:t>
+      </w:r>
+      <w:r>
+        <w:rPr>
+          <w:bCs/>
+          <w:lang w:val="fr-FR"/>
+        </w:rPr>
+        <w:t>/</w:t>
+      </w:r>
+      <w:r>
+        <w:rPr>
+          <w:rFonts w:ascii="Segoe UI Symbol" w:hAnsi="Segoe UI Symbol" w:cs="Segoe UI Symbol"/>
+          <w:bCs/>
+          <w:lang w:val="fr-FR"/>
+        </w:rPr>
+        <w:t>✖</w:t>
+      </w:r>
+      <w:r>
+        <w:rPr>
+          <w:bCs/>
+          <w:lang w:val="fr-FR"/>
+        </w:rPr>
+        <w:t xml:space="preserve"> : g</w:t>
+      </w:r>
+      <w:r>
+        <w:rPr>
+          <w:rFonts w:ascii="Aptos" w:hAnsi="Aptos" w:cs="Aptos"/>
+          <w:bCs/>
+          <w:lang w:val="fr-FR"/>
+        </w:rPr>
+        <w:t>é</w:t>
+      </w:r>
+      <w:r>
+        <w:rPr>
+          <w:bCs/>
+          <w:lang w:val="fr-FR"/>
+        </w:rPr>
+        <w:t>n</w:t>
+      </w:r>
+      <w:r>
+        <w:rPr>
+          <w:rFonts w:ascii="Aptos" w:hAnsi="Aptos" w:cs="Aptos"/>
+          <w:bCs/>
+          <w:lang w:val="fr-FR"/>
+        </w:rPr>
+        <w:t>é</w:t>
+      </w:r>
+      <w:r>
+        <w:rPr>
+          <w:bCs/>
+          <w:lang w:val="fr-FR"/>
+        </w:rPr>
+        <w:t>ration Form, ECHELLE_NOTE, emailing, PDF, PJ, etc.</w:t>
+      </w:r>
+    </w:p>
+    <w:p>
+      <w:pPr>
+        <w:numPr>
+          <w:ilvl w:val="1"/>
+          <w:numId w:val="197"/>
+        </w:numPr>
+        <w:rPr>
+          <w:bCs/>
+          <w:lang w:val="fr-FR"/>
+        </w:rPr>
+      </w:pPr>
+      <w:r>
+        <w:rPr>
+          <w:bCs/>
+          <w:lang w:val="fr-FR"/>
+        </w:rPr>
+        <w:t>Résultats + liens/logs utiles.</w:t>
+      </w:r>
+    </w:p>
+    <w:p>
+      <w:pPr>
+        <w:numPr>
           <w:ilvl w:val="0"/>
-          <w:numId w:val="193"/>
+          <w:numId w:val="197"/>
         </w:numPr>
         <w:rPr>
           <w:bCs/>
@@ -965,38 +1167,66 @@
     <w:p>
       <w:pPr>
         <w:numPr>
-          <w:ilvl w:val="0"/>
-          <w:numId w:val="193"/>
+          <w:ilvl w:val="1"/>
+          <w:numId w:val="197"/>
         </w:numPr>
         <w:rPr>
           <w:bCs/>
           <w:lang w:val="fr-FR"/>
         </w:rPr>
       </w:pPr>
-      <w:proofErr w:type="spellStart"/>
+      <w:r>
+        <w:rPr>
+          <w:bCs/>
+          <w:lang w:val="fr-FR"/>
+        </w:rPr>
+        <w:t>Bugs, incertitudes, régressions potentielles, dépendances.</w:t>
+      </w:r>
+    </w:p>
+    <w:p>
+      <w:pPr>
+        <w:numPr>
+          <w:ilvl w:val="0"/>
+          <w:numId w:val="197"/>
+        </w:numPr>
+        <w:rPr>
+          <w:bCs/>
+          <w:lang w:val="fr-FR"/>
+        </w:rPr>
+      </w:pPr>
       <w:r>
         <w:rPr>
           <w:b/>
           <w:bCs/>
           <w:lang w:val="fr-FR"/>
         </w:rPr>
-        <w:t>Playbook</w:t>
+        <w:t>Playbook de reprise (prochaines actions)</w:t>
       </w:r>
-      <w:proofErr w:type="spellEnd"/>
-      <w:r>
+    </w:p>
+    <w:p>
+      <w:pPr>
+        <w:numPr>
+          <w:ilvl w:val="1"/>
+          <w:numId w:val="197"/>
+        </w:numPr>
         <w:rPr>
-          <w:b/>
           <w:bCs/>
           <w:lang w:val="fr-FR"/>
         </w:rPr>
-        <w:t xml:space="preserve"> de reprise (prochaines actions)</w:t>
+      </w:pPr>
+      <w:r>
+        <w:rPr>
+          <w:bCs/>
+          <w:lang w:val="fr-FR"/>
+        </w:rPr>
+        <w:t>Étapes ordonnées et concrètes (où cliquer, quelle fonction exécuter, dans quel projet).</w:t>
       </w:r>
     </w:p>
     <w:p>
       <w:pPr>
         <w:numPr>
           <w:ilvl w:val="0"/>
-          <w:numId w:val="193"/>
+          <w:numId w:val="197"/>
         </w:numPr>
         <w:rPr>
           <w:bCs/>
@@ -1015,38 +1245,98 @@
     <w:p>
       <w:pPr>
         <w:numPr>
-          <w:ilvl w:val="0"/>
-          <w:numId w:val="193"/>
+          <w:ilvl w:val="1"/>
+          <w:numId w:val="197"/>
         </w:numPr>
         <w:rPr>
           <w:bCs/>
           <w:lang w:val="fr-FR"/>
         </w:rPr>
       </w:pPr>
-      <w:proofErr w:type="spellStart"/>
+      <w:r>
+        <w:rPr>
+          <w:bCs/>
+          <w:lang w:val="fr-FR"/>
+        </w:rPr>
+        <w:t xml:space="preserve">Gabarits </w:t>
+      </w:r>
+      <w:proofErr w:type="gramStart"/>
+      <w:r>
+        <w:rPr>
+          <w:bCs/>
+          <w:lang w:val="fr-FR"/>
+        </w:rPr>
+        <w:t>emails</w:t>
+      </w:r>
+      <w:proofErr w:type="gramEnd"/>
+      <w:r>
+        <w:rPr>
+          <w:bCs/>
+          <w:lang w:val="fr-FR"/>
+        </w:rPr>
+        <w:t>, sys_Composition_</w:t>
+      </w:r>
+      <w:proofErr w:type="gramStart"/>
+      <w:r>
+        <w:rPr>
+          <w:bCs/>
+          <w:lang w:val="fr-FR"/>
+        </w:rPr>
+        <w:t>Emails</w:t>
+      </w:r>
+      <w:proofErr w:type="gramEnd"/>
+      <w:r>
+        <w:rPr>
+          <w:bCs/>
+          <w:lang w:val="fr-FR"/>
+        </w:rPr>
+        <w:t>, onglets BDD, fichiers Docs.</w:t>
+      </w:r>
+    </w:p>
+    <w:p>
+      <w:pPr>
+        <w:numPr>
+          <w:ilvl w:val="0"/>
+          <w:numId w:val="197"/>
+        </w:numPr>
+        <w:rPr>
+          <w:bCs/>
+          <w:lang w:val="fr-FR"/>
+        </w:rPr>
+      </w:pPr>
       <w:r>
         <w:rPr>
           <w:b/>
           <w:bCs/>
           <w:lang w:val="fr-FR"/>
         </w:rPr>
-        <w:t>Snippets</w:t>
+        <w:t>Snippets prêts à l’emploi</w:t>
       </w:r>
-      <w:proofErr w:type="spellEnd"/>
-      <w:r>
+    </w:p>
+    <w:p>
+      <w:pPr>
+        <w:numPr>
+          <w:ilvl w:val="1"/>
+          <w:numId w:val="197"/>
+        </w:numPr>
         <w:rPr>
-          <w:b/>
           <w:bCs/>
           <w:lang w:val="fr-FR"/>
         </w:rPr>
-        <w:t xml:space="preserve"> prêts à l’emploi</w:t>
+      </w:pPr>
+      <w:r>
+        <w:rPr>
+          <w:bCs/>
+          <w:lang w:val="fr-FR"/>
+        </w:rPr>
+        <w:t>Extraits courts (≤20 lignes) : helpers, appels de test, règles CSV, etc.</w:t>
       </w:r>
     </w:p>
     <w:p>
       <w:pPr>
         <w:numPr>
           <w:ilvl w:val="0"/>
-          <w:numId w:val="193"/>
+          <w:numId w:val="197"/>
         </w:numPr>
         <w:rPr>
           <w:bCs/>
@@ -1065,8 +1355,27 @@
     <w:p>
       <w:pPr>
         <w:numPr>
+          <w:ilvl w:val="1"/>
+          <w:numId w:val="197"/>
+        </w:numPr>
+        <w:rPr>
+          <w:bCs/>
+          <w:lang w:val="fr-FR"/>
+        </w:rPr>
+      </w:pPr>
+      <w:r>
+        <w:rPr>
+          <w:bCs/>
+          <w:lang w:val="fr-FR"/>
+        </w:rPr>
+        <w:t>Liste datée des modifications significatives par fichier/fonction.</w:t>
+      </w:r>
+    </w:p>
+    <w:p>
+      <w:pPr>
+        <w:numPr>
           <w:ilvl w:val="0"/>
-          <w:numId w:val="193"/>
+          <w:numId w:val="197"/>
         </w:numPr>
         <w:rPr>
           <w:bCs/>
@@ -1085,8 +1394,262 @@
     <w:p>
       <w:pPr>
         <w:numPr>
+          <w:ilvl w:val="1"/>
+          <w:numId w:val="197"/>
+        </w:numPr>
+        <w:rPr>
+          <w:bCs/>
+          <w:lang w:val="fr-FR"/>
+        </w:rPr>
+      </w:pPr>
+      <w:r>
+        <w:rPr>
+          <w:bCs/>
+          <w:lang w:val="fr-FR"/>
+        </w:rPr>
+        <w:lastRenderedPageBreak/>
+        <w:t>Étapes vers l’objectif final, dépendances, critères de “done”.</w:t>
+      </w:r>
+    </w:p>
+    <w:p>
+      <w:pPr>
+        <w:numPr>
           <w:ilvl w:val="0"/>
-          <w:numId w:val="193"/>
+          <w:numId w:val="197"/>
+        </w:numPr>
+        <w:rPr>
+          <w:bCs/>
+          <w:lang w:val="fr-FR"/>
+        </w:rPr>
+      </w:pPr>
+      <w:r>
+        <w:rPr>
+          <w:b/>
+          <w:bCs/>
+          <w:lang w:val="fr-FR"/>
+        </w:rPr>
+        <w:t>Historique cumulatif des sessions</w:t>
+      </w:r>
+    </w:p>
+    <w:p>
+      <w:pPr>
+        <w:numPr>
+          <w:ilvl w:val="1"/>
+          <w:numId w:val="197"/>
+        </w:numPr>
+        <w:rPr>
+          <w:bCs/>
+          <w:lang w:val="fr-FR"/>
+        </w:rPr>
+      </w:pPr>
+      <w:r>
+        <w:rPr>
+          <w:bCs/>
+          <w:lang w:val="fr-FR"/>
+        </w:rPr>
+        <w:t>Tableau listant : date, focus, livrables principaux, décisions clés.</w:t>
+      </w:r>
+    </w:p>
+    <w:p>
+      <w:pPr>
+        <w:numPr>
+          <w:ilvl w:val="0"/>
+          <w:numId w:val="197"/>
+        </w:numPr>
+        <w:rPr>
+          <w:bCs/>
+          <w:lang w:val="fr-FR"/>
+        </w:rPr>
+      </w:pPr>
+      <w:r>
+        <w:rPr>
+          <w:b/>
+          <w:bCs/>
+          <w:lang w:val="fr-FR"/>
+        </w:rPr>
+        <w:t>Index des fichiers et scripts</w:t>
+      </w:r>
+    </w:p>
+    <w:p>
+      <w:pPr>
+        <w:numPr>
+          <w:ilvl w:val="1"/>
+          <w:numId w:val="197"/>
+        </w:numPr>
+        <w:rPr>
+          <w:bCs/>
+          <w:lang w:val="fr-FR"/>
+        </w:rPr>
+      </w:pPr>
+      <w:r>
+        <w:rPr>
+          <w:bCs/>
+          <w:lang w:val="fr-FR"/>
+        </w:rPr>
+        <w:t>Liste complète : nom, chemin/ID, rôle, statut (actif/déprécié/à revoir).</w:t>
+      </w:r>
+    </w:p>
+    <w:p>
+      <w:pPr>
+        <w:numPr>
+          <w:ilvl w:val="0"/>
+          <w:numId w:val="197"/>
+        </w:numPr>
+        <w:rPr>
+          <w:bCs/>
+          <w:lang w:val="fr-FR"/>
+        </w:rPr>
+      </w:pPr>
+      <w:r>
+        <w:rPr>
+          <w:b/>
+          <w:bCs/>
+          <w:lang w:val="fr-FR"/>
+        </w:rPr>
+        <w:t>Inventaire des données (CSV/BDD)</w:t>
+      </w:r>
+    </w:p>
+    <w:p>
+      <w:pPr>
+        <w:numPr>
+          <w:ilvl w:val="1"/>
+          <w:numId w:val="197"/>
+        </w:numPr>
+        <w:rPr>
+          <w:bCs/>
+          <w:lang w:val="fr-FR"/>
+        </w:rPr>
+      </w:pPr>
+      <w:r>
+        <w:rPr>
+          <w:bCs/>
+          <w:lang w:val="fr-FR"/>
+        </w:rPr>
+        <w:t>Table des colonnes (nom, usage, format attendu, dépendances).</w:t>
+      </w:r>
+    </w:p>
+    <w:p>
+      <w:pPr>
+        <w:numPr>
+          <w:ilvl w:val="0"/>
+          <w:numId w:val="197"/>
+        </w:numPr>
+        <w:rPr>
+          <w:bCs/>
+          <w:lang w:val="fr-FR"/>
+        </w:rPr>
+      </w:pPr>
+      <w:r>
+        <w:rPr>
+          <w:b/>
+          <w:bCs/>
+          <w:lang w:val="fr-FR"/>
+        </w:rPr>
+        <w:t>Synthèse des erreurs rencontrées</w:t>
+      </w:r>
+    </w:p>
+    <w:p>
+      <w:pPr>
+        <w:numPr>
+          <w:ilvl w:val="1"/>
+          <w:numId w:val="197"/>
+        </w:numPr>
+        <w:rPr>
+          <w:bCs/>
+          <w:lang w:val="fr-FR"/>
+        </w:rPr>
+      </w:pPr>
+      <w:r>
+        <w:rPr>
+          <w:bCs/>
+          <w:lang w:val="fr-FR"/>
+        </w:rPr>
+        <w:t>Messages d’erreur (Apps Script, Make, Bubble, API, etc.) + statut (corrigé/non résolu).</w:t>
+      </w:r>
+    </w:p>
+    <w:p>
+      <w:pPr>
+        <w:numPr>
+          <w:ilvl w:val="0"/>
+          <w:numId w:val="197"/>
+        </w:numPr>
+        <w:rPr>
+          <w:bCs/>
+          <w:lang w:val="fr-FR"/>
+        </w:rPr>
+      </w:pPr>
+      <w:r>
+        <w:rPr>
+          <w:b/>
+          <w:bCs/>
+          <w:lang w:val="fr-FR"/>
+        </w:rPr>
+        <w:t>Journal des hypothèses / déductions de l’IA</w:t>
+      </w:r>
+    </w:p>
+    <w:p>
+      <w:pPr>
+        <w:numPr>
+          <w:ilvl w:val="1"/>
+          <w:numId w:val="197"/>
+        </w:numPr>
+        <w:rPr>
+          <w:bCs/>
+          <w:lang w:val="fr-FR"/>
+        </w:rPr>
+      </w:pPr>
+      <w:r>
+        <w:rPr>
+          <w:bCs/>
+          <w:lang w:val="fr-FR"/>
+        </w:rPr>
+        <w:t>Liste des points déduits, incertains, ou marqués {{à compléter}}, avec sources.</w:t>
+      </w:r>
+    </w:p>
+    <w:p>
+      <w:pPr>
+        <w:numPr>
+          <w:ilvl w:val="0"/>
+          <w:numId w:val="197"/>
+        </w:numPr>
+        <w:rPr>
+          <w:bCs/>
+          <w:lang w:val="fr-FR"/>
+        </w:rPr>
+      </w:pPr>
+      <w:r>
+        <w:rPr>
+          <w:b/>
+          <w:bCs/>
+          <w:lang w:val="fr-FR"/>
+        </w:rPr>
+        <w:t>Matrice utilisateurs / fonctionnalités</w:t>
+      </w:r>
+    </w:p>
+    <w:p>
+      <w:pPr>
+        <w:numPr>
+          <w:ilvl w:val="1"/>
+          <w:numId w:val="197"/>
+        </w:numPr>
+        <w:rPr>
+          <w:bCs/>
+          <w:lang w:val="fr-FR"/>
+        </w:rPr>
+      </w:pPr>
+      <w:r>
+        <w:rPr>
+          <w:bCs/>
+          <w:lang w:val="fr-FR"/>
+        </w:rPr>
+        <w:t>Tableau : type d’utilisateur vs fonctionnalités/outils associés.</w:t>
+      </w:r>
+    </w:p>
+    <w:p>
+      <w:pPr>
+        <w:numPr>
+          <w:ilvl w:val="0"/>
+          <w:numId w:val="197"/>
         </w:numPr>
         <w:rPr>
           <w:bCs/>
@@ -1105,8 +1668,27 @@
     <w:p>
       <w:pPr>
         <w:numPr>
+          <w:ilvl w:val="1"/>
+          <w:numId w:val="197"/>
+        </w:numPr>
+        <w:rPr>
+          <w:bCs/>
+          <w:lang w:val="fr-FR"/>
+        </w:rPr>
+      </w:pPr>
+      <w:r>
+        <w:rPr>
+          <w:bCs/>
+          <w:lang w:val="fr-FR"/>
+        </w:rPr>
+        <w:t>Liste d’items ouverts à arbitrer plus tard (sans poser de questions).</w:t>
+      </w:r>
+    </w:p>
+    <w:p>
+      <w:pPr>
+        <w:numPr>
           <w:ilvl w:val="0"/>
-          <w:numId w:val="193"/>
+          <w:numId w:val="197"/>
         </w:numPr>
         <w:rPr>
           <w:bCs/>
@@ -1125,8 +1707,66 @@
     <w:p>
       <w:pPr>
         <w:numPr>
+          <w:ilvl w:val="1"/>
+          <w:numId w:val="197"/>
+        </w:numPr>
+        <w:rPr>
+          <w:bCs/>
+          <w:lang w:val="fr-FR"/>
+        </w:rPr>
+      </w:pPr>
+      <w:r>
+        <w:rPr>
+          <w:bCs/>
+          <w:lang w:val="fr-FR"/>
+        </w:rPr>
+        <w:t>Copies/commits disponibles, procédure de retour arrière.</w:t>
+      </w:r>
+    </w:p>
+    <w:p>
+      <w:pPr>
+        <w:numPr>
           <w:ilvl w:val="0"/>
-          <w:numId w:val="193"/>
+          <w:numId w:val="197"/>
+        </w:numPr>
+        <w:rPr>
+          <w:bCs/>
+          <w:lang w:val="fr-FR"/>
+        </w:rPr>
+      </w:pPr>
+      <w:r>
+        <w:rPr>
+          <w:b/>
+          <w:bCs/>
+          <w:lang w:val="fr-FR"/>
+        </w:rPr>
+        <w:t>Carte relationnelle des modules (Mermaid/Graphviz)</w:t>
+      </w:r>
+    </w:p>
+    <w:p>
+      <w:pPr>
+        <w:numPr>
+          <w:ilvl w:val="1"/>
+          <w:numId w:val="197"/>
+        </w:numPr>
+        <w:rPr>
+          <w:bCs/>
+          <w:lang w:val="fr-FR"/>
+        </w:rPr>
+      </w:pPr>
+      <w:r>
+        <w:rPr>
+          <w:bCs/>
+          <w:lang w:val="fr-FR"/>
+        </w:rPr>
+        <w:t>Diagramme textuel des relations entre Moteur, Template, Form, BDD, etc.</w:t>
+      </w:r>
+    </w:p>
+    <w:p>
+      <w:pPr>
+        <w:numPr>
+          <w:ilvl w:val="0"/>
+          <w:numId w:val="197"/>
         </w:numPr>
         <w:rPr>
           <w:bCs/>
@@ -1145,8 +1785,27 @@
     <w:p>
       <w:pPr>
         <w:numPr>
+          <w:ilvl w:val="1"/>
+          <w:numId w:val="197"/>
+        </w:numPr>
+        <w:rPr>
+          <w:bCs/>
+          <w:lang w:val="fr-FR"/>
+        </w:rPr>
+      </w:pPr>
+      <w:r>
+        <w:rPr>
+          <w:bCs/>
+          <w:lang w:val="fr-FR"/>
+        </w:rPr>
+        <w:t>Nommage (tests, feuilles, colonnes, IDs, profils), style des menus, formats JSON acceptés.</w:t>
+      </w:r>
+    </w:p>
+    <w:p>
+      <w:pPr>
+        <w:numPr>
           <w:ilvl w:val="0"/>
-          <w:numId w:val="193"/>
+          <w:numId w:val="197"/>
         </w:numPr>
         <w:rPr>
           <w:bCs/>
@@ -1165,8 +1824,27 @@
     <w:p>
       <w:pPr>
         <w:numPr>
+          <w:ilvl w:val="1"/>
+          <w:numId w:val="197"/>
+        </w:numPr>
+        <w:rPr>
+          <w:bCs/>
+          <w:lang w:val="fr-FR"/>
+        </w:rPr>
+      </w:pPr>
+      <w:r>
+        <w:rPr>
+          <w:bCs/>
+          <w:lang w:val="fr-FR"/>
+        </w:rPr>
+        <w:t>Table alphabétique : Terme | Définition | Catégorie | Alias | Référence | Notes.</w:t>
+      </w:r>
+    </w:p>
+    <w:p>
+      <w:pPr>
+        <w:numPr>
           <w:ilvl w:val="0"/>
-          <w:numId w:val="193"/>
+          <w:numId w:val="197"/>
         </w:numPr>
         <w:rPr>
           <w:bCs/>
@@ -1184,6 +1862,10 @@
     </w:p>
     <w:p>
       <w:pPr>
+        <w:numPr>
+          <w:ilvl w:val="1"/>
+          <w:numId w:val="197"/>
+        </w:numPr>
         <w:rPr>
           <w:bCs/>
           <w:lang w:val="fr-FR"/>
@@ -1194,15 +1876,16 @@
           <w:bCs/>
           <w:lang w:val="fr-FR"/>
         </w:rPr>
-        <w:pict w14:anchorId="598B51C1">
-          <v:rect id="_x0000_i1065" style="width:0;height:1.5pt" o:hralign="center" o:hrstd="t" o:hr="t" fillcolor="#a0a0a0" stroked="f"/>
-        </w:pict>
+        <w:t>Table alphabétique : Nom | Type | Portée | Fichier/Onglet | Usage | Format | Exemple | Dépendances | Historique.</w:t>
       </w:r>
     </w:p>
     <w:p>
       <w:pPr>
+        <w:numPr>
+          <w:ilvl w:val="0"/>
+          <w:numId w:val="197"/>
+        </w:numPr>
         <w:rPr>
-          <w:b/>
           <w:bCs/>
           <w:lang w:val="fr-FR"/>
         </w:rPr>
@@ -1213,6 +1896,60 @@
           <w:bCs/>
           <w:lang w:val="fr-FR"/>
         </w:rPr>
+        <w:t>Guide de reprise pour IA suivante</w:t>
+      </w:r>
+    </w:p>
+    <w:p>
+      <w:pPr>
+        <w:numPr>
+          <w:ilvl w:val="1"/>
+          <w:numId w:val="197"/>
+        </w:numPr>
+        <w:rPr>
+          <w:bCs/>
+          <w:lang w:val="fr-FR"/>
+        </w:rPr>
+      </w:pPr>
+      <w:r>
+        <w:rPr>
+          <w:bCs/>
+          <w:lang w:val="fr-FR"/>
+        </w:rPr>
+        <w:t>Instructions : lire Résumé narratif, vérifier Glossaire &amp; Registre, utiliser Index des fichiers.</w:t>
+      </w:r>
+    </w:p>
+    <w:p>
+      <w:pPr>
+        <w:rPr>
+          <w:bCs/>
+          <w:lang w:val="fr-FR"/>
+        </w:rPr>
+      </w:pPr>
+      <w:r>
+        <w:rPr>
+          <w:bCs/>
+          <w:lang w:val="fr-FR"/>
+        </w:rPr>
+        <w:pict w14:anchorId="76206E7F">
+          <v:rect id="_x0000_i1029" style="width:0;height:1.5pt" o:hralign="center" o:hrstd="t" o:hr="t" fillcolor="#a0a0a0" stroked="f"/>
+        </w:pict>
+      </w:r>
+    </w:p>
+    <w:p>
+      <w:pPr>
+        <w:rPr>
+          <w:b/>
+          <w:bCs/>
+          <w:lang w:val="fr-FR"/>
+        </w:rPr>
+      </w:pPr>
+      <w:r>
+        <w:rPr>
+          <w:b/>
+          <w:bCs/>
+          <w:lang w:val="fr-FR"/>
+        </w:rPr>
+        <w:lastRenderedPageBreak/>
         <w:t>Règles supplémentaires</w:t>
       </w:r>
     </w:p>
@@ -1220,7 +1957,7 @@
       <w:pPr>
         <w:numPr>
           <w:ilvl w:val="0"/>
-          <w:numId w:val="194"/>
+          <w:numId w:val="198"/>
         </w:numPr>
         <w:rPr>
           <w:bCs/>
@@ -1239,7 +1976,7 @@
       <w:pPr>
         <w:numPr>
           <w:ilvl w:val="0"/>
-          <w:numId w:val="194"/>
+          <w:numId w:val="198"/>
         </w:numPr>
         <w:rPr>
           <w:bCs/>
@@ -1258,7 +1995,7 @@
       <w:pPr>
         <w:numPr>
           <w:ilvl w:val="0"/>
-          <w:numId w:val="194"/>
+          <w:numId w:val="198"/>
         </w:numPr>
         <w:rPr>
           <w:bCs/>
@@ -1277,7 +2014,7 @@
       <w:pPr>
         <w:numPr>
           <w:ilvl w:val="0"/>
-          <w:numId w:val="194"/>
+          <w:numId w:val="198"/>
         </w:numPr>
         <w:rPr>
           <w:bCs/>
@@ -1319,8 +2056,8 @@
           <w:bCs/>
           <w:lang w:val="fr-FR"/>
         </w:rPr>
-        <w:pict w14:anchorId="50CC42FC">
-          <v:rect id="_x0000_i1066" style="width:0;height:1.5pt" o:hralign="center" o:hrstd="t" o:hr="t" fillcolor="#a0a0a0" stroked="f"/>
+        <w:pict w14:anchorId="553BE550">
+          <v:rect id="_x0000_i1030" style="width:0;height:1.5pt" o:hralign="center" o:hrstd="t" o:hr="t" fillcolor="#a0a0a0" stroked="f"/>
         </w:pict>
       </w:r>
     </w:p>
@@ -1361,24 +2098,29 @@
           <w:bCs/>
           <w:lang w:val="fr-FR"/>
         </w:rPr>
-        <w:t xml:space="preserve">unique document </w:t>
+        <w:t>unique document Markdown</w:t>
       </w:r>
-      <w:proofErr w:type="spellStart"/>
+      <w:r>
+        <w:rPr>
+          <w:bCs/>
+          <w:lang w:val="fr-FR"/>
+        </w:rPr>
+        <w:t xml:space="preserve"> respectant ce plan et ces règles, incluant les annexes fusionnées/enrichies et toutes les extensions prévues.</w:t>
+      </w:r>
+    </w:p>
+    <w:p>
+      <w:pPr>
+        <w:rPr>
+          <w:lang w:val="fr-FR"/>
+        </w:rPr>
+      </w:pPr>
       <w:r>
         <w:rPr>
           <w:b/>
           <w:bCs/>
           <w:lang w:val="fr-FR"/>
         </w:rPr>
-        <w:t>Markdown</w:t>
-      </w:r>
-      <w:proofErr w:type="spellEnd"/>
-      <w:r>
-        <w:rPr>
-          <w:bCs/>
-          <w:lang w:val="fr-FR"/>
-        </w:rPr>
-        <w:t xml:space="preserve"> respectant ce plan et ces règles, incluant les annexes fusionnées/enrichies.</w:t>
+        <w:t>"Génère le document de synthèse complet en une seule fois, y compris toutes les sections et les annexes, sans utiliser de phrase d'interruption."</w:t>
       </w:r>
     </w:p>
     <w:p/>
@@ -15122,6 +15864,155 @@
     </w:lvl>
   </w:abstractNum>
   <w:abstractNum w:abstractNumId="95" w15:restartNumberingAfterBreak="0">
+    <w:nsid w:val="3F86281A"/>
+    <w:multiLevelType w:val="multilevel"/>
+    <w:tmpl w:val="6E644C36"/>
+    <w:lvl w:ilvl="0">
+      <w:start w:val="1"/>
+      <w:numFmt w:val="bullet"/>
+      <w:lvlText w:val=""/>
+      <w:lvlJc w:val="left"/>
+      <w:pPr>
+        <w:tabs>
+          <w:tab w:val="num" w:pos="720"/>
+        </w:tabs>
+        <w:ind w:left="720" w:hanging="360"/>
+      </w:pPr>
+      <w:rPr>
+        <w:rFonts w:ascii="Symbol" w:hAnsi="Symbol" w:hint="default"/>
+        <w:sz w:val="20"/>
+      </w:rPr>
+    </w:lvl>
+    <w:lvl w:ilvl="1" w:tentative="1">
+      <w:start w:val="1"/>
+      <w:numFmt w:val="bullet"/>
+      <w:lvlText w:val="o"/>
+      <w:lvlJc w:val="left"/>
+      <w:pPr>
+        <w:tabs>
+          <w:tab w:val="num" w:pos="1440"/>
+        </w:tabs>
+        <w:ind w:left="1440" w:hanging="360"/>
+      </w:pPr>
+      <w:rPr>
+        <w:rFonts w:ascii="Courier New" w:hAnsi="Courier New" w:hint="default"/>
+        <w:sz w:val="20"/>
+      </w:rPr>
+    </w:lvl>
+    <w:lvl w:ilvl="2" w:tentative="1">
+      <w:start w:val="1"/>
+      <w:numFmt w:val="bullet"/>
+      <w:lvlText w:val=""/>
+      <w:lvlJc w:val="left"/>
+      <w:pPr>
+        <w:tabs>
+          <w:tab w:val="num" w:pos="2160"/>
+        </w:tabs>
+        <w:ind w:left="2160" w:hanging="360"/>
+      </w:pPr>
+      <w:rPr>
+        <w:rFonts w:ascii="Wingdings" w:hAnsi="Wingdings" w:hint="default"/>
+        <w:sz w:val="20"/>
+      </w:rPr>
+    </w:lvl>
+    <w:lvl w:ilvl="3" w:tentative="1">
+      <w:start w:val="1"/>
+      <w:numFmt w:val="bullet"/>
+      <w:lvlText w:val=""/>
+      <w:lvlJc w:val="left"/>
+      <w:pPr>
+        <w:tabs>
+          <w:tab w:val="num" w:pos="2880"/>
+        </w:tabs>
+        <w:ind w:left="2880" w:hanging="360"/>
+      </w:pPr>
+      <w:rPr>
+        <w:rFonts w:ascii="Wingdings" w:hAnsi="Wingdings" w:hint="default"/>
+        <w:sz w:val="20"/>
+      </w:rPr>
+    </w:lvl>
+    <w:lvl w:ilvl="4" w:tentative="1">
+      <w:start w:val="1"/>
+      <w:numFmt w:val="bullet"/>
+      <w:lvlText w:val=""/>
+      <w:lvlJc w:val="left"/>
+      <w:pPr>
+        <w:tabs>
+          <w:tab w:val="num" w:pos="3600"/>
+        </w:tabs>
+        <w:ind w:left="3600" w:hanging="360"/>
+      </w:pPr>
+      <w:rPr>
+        <w:rFonts w:ascii="Wingdings" w:hAnsi="Wingdings" w:hint="default"/>
+        <w:sz w:val="20"/>
+      </w:rPr>
+    </w:lvl>
+    <w:lvl w:ilvl="5" w:tentative="1">
+      <w:start w:val="1"/>
+      <w:numFmt w:val="bullet"/>
+      <w:lvlText w:val=""/>
+      <w:lvlJc w:val="left"/>
+      <w:pPr>
+        <w:tabs>
+          <w:tab w:val="num" w:pos="4320"/>
+        </w:tabs>
+        <w:ind w:left="4320" w:hanging="360"/>
+      </w:pPr>
+      <w:rPr>
+        <w:rFonts w:ascii="Wingdings" w:hAnsi="Wingdings" w:hint="default"/>
+        <w:sz w:val="20"/>
+      </w:rPr>
+    </w:lvl>
+    <w:lvl w:ilvl="6" w:tentative="1">
+      <w:start w:val="1"/>
+      <w:numFmt w:val="bullet"/>
+      <w:lvlText w:val=""/>
+      <w:lvlJc w:val="left"/>
+      <w:pPr>
+        <w:tabs>
+          <w:tab w:val="num" w:pos="5040"/>
+        </w:tabs>
+        <w:ind w:left="5040" w:hanging="360"/>
+      </w:pPr>
+      <w:rPr>
+        <w:rFonts w:ascii="Wingdings" w:hAnsi="Wingdings" w:hint="default"/>
+        <w:sz w:val="20"/>
+      </w:rPr>
+    </w:lvl>
+    <w:lvl w:ilvl="7" w:tentative="1">
+      <w:start w:val="1"/>
+      <w:numFmt w:val="bullet"/>
+      <w:lvlText w:val=""/>
+      <w:lvlJc w:val="left"/>
+      <w:pPr>
+        <w:tabs>
+          <w:tab w:val="num" w:pos="5760"/>
+        </w:tabs>
+        <w:ind w:left="5760" w:hanging="360"/>
+      </w:pPr>
+      <w:rPr>
+        <w:rFonts w:ascii="Wingdings" w:hAnsi="Wingdings" w:hint="default"/>
+        <w:sz w:val="20"/>
+      </w:rPr>
+    </w:lvl>
+    <w:lvl w:ilvl="8" w:tentative="1">
+      <w:start w:val="1"/>
+      <w:numFmt w:val="bullet"/>
+      <w:lvlText w:val=""/>
+      <w:lvlJc w:val="left"/>
+      <w:pPr>
+        <w:tabs>
+          <w:tab w:val="num" w:pos="6480"/>
+        </w:tabs>
+        <w:ind w:left="6480" w:hanging="360"/>
+      </w:pPr>
+      <w:rPr>
+        <w:rFonts w:ascii="Wingdings" w:hAnsi="Wingdings" w:hint="default"/>
+        <w:sz w:val="20"/>
+      </w:rPr>
+    </w:lvl>
+  </w:abstractNum>
+  <w:abstractNum w:abstractNumId="96" w15:restartNumberingAfterBreak="0">
     <w:nsid w:val="404A1DDB"/>
     <w:multiLevelType w:val="multilevel"/>
     <w:tmpl w:val="1372450C"/>
@@ -15270,7 +16161,7 @@
       </w:rPr>
     </w:lvl>
   </w:abstractNum>
-  <w:abstractNum w:abstractNumId="96" w15:restartNumberingAfterBreak="0">
+  <w:abstractNum w:abstractNumId="97" w15:restartNumberingAfterBreak="0">
     <w:nsid w:val="43A431A6"/>
     <w:multiLevelType w:val="multilevel"/>
     <w:tmpl w:val="B7C4494E"/>
@@ -15419,7 +16310,7 @@
       </w:rPr>
     </w:lvl>
   </w:abstractNum>
-  <w:abstractNum w:abstractNumId="97" w15:restartNumberingAfterBreak="0">
+  <w:abstractNum w:abstractNumId="98" w15:restartNumberingAfterBreak="0">
     <w:nsid w:val="444D1127"/>
     <w:multiLevelType w:val="multilevel"/>
     <w:tmpl w:val="7BB40AD4"/>
@@ -15564,7 +16455,7 @@
       </w:rPr>
     </w:lvl>
   </w:abstractNum>
-  <w:abstractNum w:abstractNumId="98" w15:restartNumberingAfterBreak="0">
+  <w:abstractNum w:abstractNumId="99" w15:restartNumberingAfterBreak="0">
     <w:nsid w:val="448720CB"/>
     <w:multiLevelType w:val="multilevel"/>
     <w:tmpl w:val="8AA67A0A"/>
@@ -15713,7 +16604,124 @@
       </w:rPr>
     </w:lvl>
   </w:abstractNum>
-  <w:abstractNum w:abstractNumId="99" w15:restartNumberingAfterBreak="0">
+  <w:abstractNum w:abstractNumId="100" w15:restartNumberingAfterBreak="0">
+    <w:nsid w:val="45191DF7"/>
+    <w:multiLevelType w:val="multilevel"/>
+    <w:tmpl w:val="8634DF70"/>
+    <w:lvl w:ilvl="0">
+      <w:start w:val="1"/>
+      <w:numFmt w:val="decimal"/>
+      <w:lvlText w:val="%1."/>
+      <w:lvlJc w:val="left"/>
+      <w:pPr>
+        <w:tabs>
+          <w:tab w:val="num" w:pos="720"/>
+        </w:tabs>
+        <w:ind w:left="720" w:hanging="360"/>
+      </w:pPr>
+    </w:lvl>
+    <w:lvl w:ilvl="1">
+      <w:start w:val="1"/>
+      <w:numFmt w:val="bullet"/>
+      <w:lvlText w:val="o"/>
+      <w:lvlJc w:val="left"/>
+      <w:pPr>
+        <w:tabs>
+          <w:tab w:val="num" w:pos="1440"/>
+        </w:tabs>
+        <w:ind w:left="1440" w:hanging="360"/>
+      </w:pPr>
+      <w:rPr>
+        <w:rFonts w:ascii="Courier New" w:hAnsi="Courier New" w:hint="default"/>
+        <w:sz w:val="20"/>
+      </w:rPr>
+    </w:lvl>
+    <w:lvl w:ilvl="2" w:tentative="1">
+      <w:start w:val="1"/>
+      <w:numFmt w:val="decimal"/>
+      <w:lvlText w:val="%3."/>
+      <w:lvlJc w:val="left"/>
+      <w:pPr>
+        <w:tabs>
+          <w:tab w:val="num" w:pos="2160"/>
+        </w:tabs>
+        <w:ind w:left="2160" w:hanging="360"/>
+      </w:pPr>
+    </w:lvl>
+    <w:lvl w:ilvl="3" w:tentative="1">
+      <w:start w:val="1"/>
+      <w:numFmt w:val="decimal"/>
+      <w:lvlText w:val="%4."/>
+      <w:lvlJc w:val="left"/>
+      <w:pPr>
+        <w:tabs>
+          <w:tab w:val="num" w:pos="2880"/>
+        </w:tabs>
+        <w:ind w:left="2880" w:hanging="360"/>
+      </w:pPr>
+    </w:lvl>
+    <w:lvl w:ilvl="4" w:tentative="1">
+      <w:start w:val="1"/>
+      <w:numFmt w:val="decimal"/>
+      <w:lvlText w:val="%5."/>
+      <w:lvlJc w:val="left"/>
+      <w:pPr>
+        <w:tabs>
+          <w:tab w:val="num" w:pos="3600"/>
+        </w:tabs>
+        <w:ind w:left="3600" w:hanging="360"/>
+      </w:pPr>
+    </w:lvl>
+    <w:lvl w:ilvl="5" w:tentative="1">
+      <w:start w:val="1"/>
+      <w:numFmt w:val="decimal"/>
+      <w:lvlText w:val="%6."/>
+      <w:lvlJc w:val="left"/>
+      <w:pPr>
+        <w:tabs>
+          <w:tab w:val="num" w:pos="4320"/>
+        </w:tabs>
+        <w:ind w:left="4320" w:hanging="360"/>
+      </w:pPr>
+    </w:lvl>
+    <w:lvl w:ilvl="6" w:tentative="1">
+      <w:start w:val="1"/>
+      <w:numFmt w:val="decimal"/>
+      <w:lvlText w:val="%7."/>
+      <w:lvlJc w:val="left"/>
+      <w:pPr>
+        <w:tabs>
+          <w:tab w:val="num" w:pos="5040"/>
+        </w:tabs>
+        <w:ind w:left="5040" w:hanging="360"/>
+      </w:pPr>
+    </w:lvl>
+    <w:lvl w:ilvl="7" w:tentative="1">
+      <w:start w:val="1"/>
+      <w:numFmt w:val="decimal"/>
+      <w:lvlText w:val="%8."/>
+      <w:lvlJc w:val="left"/>
+      <w:pPr>
+        <w:tabs>
+          <w:tab w:val="num" w:pos="5760"/>
+        </w:tabs>
+        <w:ind w:left="5760" w:hanging="360"/>
+      </w:pPr>
+    </w:lvl>
+    <w:lvl w:ilvl="8" w:tentative="1">
+      <w:start w:val="1"/>
+      <w:numFmt w:val="decimal"/>
+      <w:lvlText w:val="%9."/>
+      <w:lvlJc w:val="left"/>
+      <w:pPr>
+        <w:tabs>
+          <w:tab w:val="num" w:pos="6480"/>
+        </w:tabs>
+        <w:ind w:left="6480" w:hanging="360"/>
+      </w:pPr>
+    </w:lvl>
+  </w:abstractNum>
+  <w:abstractNum w:abstractNumId="101" w15:restartNumberingAfterBreak="0">
     <w:nsid w:val="457010D0"/>
     <w:multiLevelType w:val="multilevel"/>
     <w:tmpl w:val="7D8029F2"/>
@@ -15862,7 +16870,7 @@
       </w:rPr>
     </w:lvl>
   </w:abstractNum>
-  <w:abstractNum w:abstractNumId="100" w15:restartNumberingAfterBreak="0">
+  <w:abstractNum w:abstractNumId="102" w15:restartNumberingAfterBreak="0">
     <w:nsid w:val="45DD61A9"/>
     <w:multiLevelType w:val="multilevel"/>
     <w:tmpl w:val="B886828E"/>
@@ -15979,7 +16987,7 @@
       </w:pPr>
     </w:lvl>
   </w:abstractNum>
-  <w:abstractNum w:abstractNumId="101" w15:restartNumberingAfterBreak="0">
+  <w:abstractNum w:abstractNumId="103" w15:restartNumberingAfterBreak="0">
     <w:nsid w:val="464F19D3"/>
     <w:multiLevelType w:val="multilevel"/>
     <w:tmpl w:val="BC323D78"/>
@@ -16128,7 +17136,7 @@
       </w:rPr>
     </w:lvl>
   </w:abstractNum>
-  <w:abstractNum w:abstractNumId="102" w15:restartNumberingAfterBreak="0">
+  <w:abstractNum w:abstractNumId="104" w15:restartNumberingAfterBreak="0">
     <w:nsid w:val="46F27205"/>
     <w:multiLevelType w:val="multilevel"/>
     <w:tmpl w:val="0AFCE1BC"/>
@@ -16277,7 +17285,156 @@
       </w:rPr>
     </w:lvl>
   </w:abstractNum>
-  <w:abstractNum w:abstractNumId="103" w15:restartNumberingAfterBreak="0">
+  <w:abstractNum w:abstractNumId="105" w15:restartNumberingAfterBreak="0">
+    <w:nsid w:val="47443FAB"/>
+    <w:multiLevelType w:val="multilevel"/>
+    <w:tmpl w:val="A922F3F0"/>
+    <w:lvl w:ilvl="0">
+      <w:start w:val="1"/>
+      <w:numFmt w:val="bullet"/>
+      <w:lvlText w:val=""/>
+      <w:lvlJc w:val="left"/>
+      <w:pPr>
+        <w:tabs>
+          <w:tab w:val="num" w:pos="720"/>
+        </w:tabs>
+        <w:ind w:left="720" w:hanging="360"/>
+      </w:pPr>
+      <w:rPr>
+        <w:rFonts w:ascii="Symbol" w:hAnsi="Symbol" w:hint="default"/>
+        <w:sz w:val="20"/>
+      </w:rPr>
+    </w:lvl>
+    <w:lvl w:ilvl="1" w:tentative="1">
+      <w:start w:val="1"/>
+      <w:numFmt w:val="bullet"/>
+      <w:lvlText w:val="o"/>
+      <w:lvlJc w:val="left"/>
+      <w:pPr>
+        <w:tabs>
+          <w:tab w:val="num" w:pos="1440"/>
+        </w:tabs>
+        <w:ind w:left="1440" w:hanging="360"/>
+      </w:pPr>
+      <w:rPr>
+        <w:rFonts w:ascii="Courier New" w:hAnsi="Courier New" w:hint="default"/>
+        <w:sz w:val="20"/>
+      </w:rPr>
+    </w:lvl>
+    <w:lvl w:ilvl="2" w:tentative="1">
+      <w:start w:val="1"/>
+      <w:numFmt w:val="bullet"/>
+      <w:lvlText w:val=""/>
+      <w:lvlJc w:val="left"/>
+      <w:pPr>
+        <w:tabs>
+          <w:tab w:val="num" w:pos="2160"/>
+        </w:tabs>
+        <w:ind w:left="2160" w:hanging="360"/>
+      </w:pPr>
+      <w:rPr>
+        <w:rFonts w:ascii="Wingdings" w:hAnsi="Wingdings" w:hint="default"/>
+        <w:sz w:val="20"/>
+      </w:rPr>
+    </w:lvl>
+    <w:lvl w:ilvl="3" w:tentative="1">
+      <w:start w:val="1"/>
+      <w:numFmt w:val="bullet"/>
+      <w:lvlText w:val=""/>
+      <w:lvlJc w:val="left"/>
+      <w:pPr>
+        <w:tabs>
+          <w:tab w:val="num" w:pos="2880"/>
+        </w:tabs>
+        <w:ind w:left="2880" w:hanging="360"/>
+      </w:pPr>
+      <w:rPr>
+        <w:rFonts w:ascii="Wingdings" w:hAnsi="Wingdings" w:hint="default"/>
+        <w:sz w:val="20"/>
+      </w:rPr>
+    </w:lvl>
+    <w:lvl w:ilvl="4" w:tentative="1">
+      <w:start w:val="1"/>
+      <w:numFmt w:val="bullet"/>
+      <w:lvlText w:val=""/>
+      <w:lvlJc w:val="left"/>
+      <w:pPr>
+        <w:tabs>
+          <w:tab w:val="num" w:pos="3600"/>
+        </w:tabs>
+        <w:ind w:left="3600" w:hanging="360"/>
+      </w:pPr>
+      <w:rPr>
+        <w:rFonts w:ascii="Wingdings" w:hAnsi="Wingdings" w:hint="default"/>
+        <w:sz w:val="20"/>
+      </w:rPr>
+    </w:lvl>
+    <w:lvl w:ilvl="5" w:tentative="1">
+      <w:start w:val="1"/>
+      <w:numFmt w:val="bullet"/>
+      <w:lvlText w:val=""/>
+      <w:lvlJc w:val="left"/>
+      <w:pPr>
+        <w:tabs>
+          <w:tab w:val="num" w:pos="4320"/>
+        </w:tabs>
+        <w:ind w:left="4320" w:hanging="360"/>
+      </w:pPr>
+      <w:rPr>
+        <w:rFonts w:ascii="Wingdings" w:hAnsi="Wingdings" w:hint="default"/>
+        <w:sz w:val="20"/>
+      </w:rPr>
+    </w:lvl>
+    <w:lvl w:ilvl="6" w:tentative="1">
+      <w:start w:val="1"/>
+      <w:numFmt w:val="bullet"/>
+      <w:lvlText w:val=""/>
+      <w:lvlJc w:val="left"/>
+      <w:pPr>
+        <w:tabs>
+          <w:tab w:val="num" w:pos="5040"/>
+        </w:tabs>
+        <w:ind w:left="5040" w:hanging="360"/>
+      </w:pPr>
+      <w:rPr>
+        <w:rFonts w:ascii="Wingdings" w:hAnsi="Wingdings" w:hint="default"/>
+        <w:sz w:val="20"/>
+      </w:rPr>
+    </w:lvl>
+    <w:lvl w:ilvl="7" w:tentative="1">
+      <w:start w:val="1"/>
+      <w:numFmt w:val="bullet"/>
+      <w:lvlText w:val=""/>
+      <w:lvlJc w:val="left"/>
+      <w:pPr>
+        <w:tabs>
+          <w:tab w:val="num" w:pos="5760"/>
+        </w:tabs>
+        <w:ind w:left="5760" w:hanging="360"/>
+      </w:pPr>
+      <w:rPr>
+        <w:rFonts w:ascii="Wingdings" w:hAnsi="Wingdings" w:hint="default"/>
+        <w:sz w:val="20"/>
+      </w:rPr>
+    </w:lvl>
+    <w:lvl w:ilvl="8" w:tentative="1">
+      <w:start w:val="1"/>
+      <w:numFmt w:val="bullet"/>
+      <w:lvlText w:val=""/>
+      <w:lvlJc w:val="left"/>
+      <w:pPr>
+        <w:tabs>
+          <w:tab w:val="num" w:pos="6480"/>
+        </w:tabs>
+        <w:ind w:left="6480" w:hanging="360"/>
+      </w:pPr>
+      <w:rPr>
+        <w:rFonts w:ascii="Wingdings" w:hAnsi="Wingdings" w:hint="default"/>
+        <w:sz w:val="20"/>
+      </w:rPr>
+    </w:lvl>
+  </w:abstractNum>
+  <w:abstractNum w:abstractNumId="106" w15:restartNumberingAfterBreak="0">
     <w:nsid w:val="47832412"/>
     <w:multiLevelType w:val="multilevel"/>
     <w:tmpl w:val="F3943DF8"/>
@@ -16390,7 +17547,7 @@
       </w:pPr>
     </w:lvl>
   </w:abstractNum>
-  <w:abstractNum w:abstractNumId="104" w15:restartNumberingAfterBreak="0">
+  <w:abstractNum w:abstractNumId="107" w15:restartNumberingAfterBreak="0">
     <w:nsid w:val="480D5336"/>
     <w:multiLevelType w:val="multilevel"/>
     <w:tmpl w:val="18B66C58"/>
@@ -16539,7 +17696,7 @@
       </w:rPr>
     </w:lvl>
   </w:abstractNum>
-  <w:abstractNum w:abstractNumId="105" w15:restartNumberingAfterBreak="0">
+  <w:abstractNum w:abstractNumId="108" w15:restartNumberingAfterBreak="0">
     <w:nsid w:val="48DF4AE5"/>
     <w:multiLevelType w:val="multilevel"/>
     <w:tmpl w:val="D2ACBF36"/>
@@ -16684,7 +17841,7 @@
       </w:rPr>
     </w:lvl>
   </w:abstractNum>
-  <w:abstractNum w:abstractNumId="106" w15:restartNumberingAfterBreak="0">
+  <w:abstractNum w:abstractNumId="109" w15:restartNumberingAfterBreak="0">
     <w:nsid w:val="49674015"/>
     <w:multiLevelType w:val="multilevel"/>
     <w:tmpl w:val="5CDA808A"/>
@@ -16833,7 +17990,7 @@
       </w:rPr>
     </w:lvl>
   </w:abstractNum>
-  <w:abstractNum w:abstractNumId="107" w15:restartNumberingAfterBreak="0">
+  <w:abstractNum w:abstractNumId="110" w15:restartNumberingAfterBreak="0">
     <w:nsid w:val="4C4C44DB"/>
     <w:multiLevelType w:val="multilevel"/>
     <w:tmpl w:val="A2B6B3AC"/>
@@ -16982,7 +18139,7 @@
       </w:rPr>
     </w:lvl>
   </w:abstractNum>
-  <w:abstractNum w:abstractNumId="108" w15:restartNumberingAfterBreak="0">
+  <w:abstractNum w:abstractNumId="111" w15:restartNumberingAfterBreak="0">
     <w:nsid w:val="4CF45F14"/>
     <w:multiLevelType w:val="multilevel"/>
     <w:tmpl w:val="8E8888EA"/>
@@ -17131,7 +18288,7 @@
       </w:rPr>
     </w:lvl>
   </w:abstractNum>
-  <w:abstractNum w:abstractNumId="109" w15:restartNumberingAfterBreak="0">
+  <w:abstractNum w:abstractNumId="112" w15:restartNumberingAfterBreak="0">
     <w:nsid w:val="4D062C1F"/>
     <w:multiLevelType w:val="multilevel"/>
     <w:tmpl w:val="A726E1D8"/>
@@ -17276,7 +18433,7 @@
       </w:rPr>
     </w:lvl>
   </w:abstractNum>
-  <w:abstractNum w:abstractNumId="110" w15:restartNumberingAfterBreak="0">
+  <w:abstractNum w:abstractNumId="113" w15:restartNumberingAfterBreak="0">
     <w:nsid w:val="4D6B4459"/>
     <w:multiLevelType w:val="multilevel"/>
     <w:tmpl w:val="990C0B00"/>
@@ -17425,7 +18582,7 @@
       </w:rPr>
     </w:lvl>
   </w:abstractNum>
-  <w:abstractNum w:abstractNumId="111" w15:restartNumberingAfterBreak="0">
+  <w:abstractNum w:abstractNumId="114" w15:restartNumberingAfterBreak="0">
     <w:nsid w:val="4DE1672B"/>
     <w:multiLevelType w:val="multilevel"/>
     <w:tmpl w:val="4E9E83CA"/>
@@ -17574,7 +18731,7 @@
       </w:rPr>
     </w:lvl>
   </w:abstractNum>
-  <w:abstractNum w:abstractNumId="112" w15:restartNumberingAfterBreak="0">
+  <w:abstractNum w:abstractNumId="115" w15:restartNumberingAfterBreak="0">
     <w:nsid w:val="4EF43154"/>
     <w:multiLevelType w:val="multilevel"/>
     <w:tmpl w:val="2B50E070"/>
@@ -17723,7 +18880,7 @@
       </w:rPr>
     </w:lvl>
   </w:abstractNum>
-  <w:abstractNum w:abstractNumId="113" w15:restartNumberingAfterBreak="0">
+  <w:abstractNum w:abstractNumId="116" w15:restartNumberingAfterBreak="0">
     <w:nsid w:val="4F012EF7"/>
     <w:multiLevelType w:val="multilevel"/>
     <w:tmpl w:val="D256C35E"/>
@@ -17872,7 +19029,7 @@
       </w:rPr>
     </w:lvl>
   </w:abstractNum>
-  <w:abstractNum w:abstractNumId="114" w15:restartNumberingAfterBreak="0">
+  <w:abstractNum w:abstractNumId="117" w15:restartNumberingAfterBreak="0">
     <w:nsid w:val="4F6E0069"/>
     <w:multiLevelType w:val="multilevel"/>
     <w:tmpl w:val="F412E96C"/>
@@ -17985,7 +19142,7 @@
       </w:pPr>
     </w:lvl>
   </w:abstractNum>
-  <w:abstractNum w:abstractNumId="115" w15:restartNumberingAfterBreak="0">
+  <w:abstractNum w:abstractNumId="118" w15:restartNumberingAfterBreak="0">
     <w:nsid w:val="50C4484A"/>
     <w:multiLevelType w:val="multilevel"/>
     <w:tmpl w:val="129406DA"/>
@@ -18134,7 +19291,7 @@
       </w:rPr>
     </w:lvl>
   </w:abstractNum>
-  <w:abstractNum w:abstractNumId="116" w15:restartNumberingAfterBreak="0">
+  <w:abstractNum w:abstractNumId="119" w15:restartNumberingAfterBreak="0">
     <w:nsid w:val="51D76CF1"/>
     <w:multiLevelType w:val="multilevel"/>
     <w:tmpl w:val="49DE3B5C"/>
@@ -18283,7 +19440,7 @@
       </w:rPr>
     </w:lvl>
   </w:abstractNum>
-  <w:abstractNum w:abstractNumId="117" w15:restartNumberingAfterBreak="0">
+  <w:abstractNum w:abstractNumId="120" w15:restartNumberingAfterBreak="0">
     <w:nsid w:val="52B0679E"/>
     <w:multiLevelType w:val="multilevel"/>
     <w:tmpl w:val="BAA0FE20"/>
@@ -18432,7 +19589,7 @@
       </w:rPr>
     </w:lvl>
   </w:abstractNum>
-  <w:abstractNum w:abstractNumId="118" w15:restartNumberingAfterBreak="0">
+  <w:abstractNum w:abstractNumId="121" w15:restartNumberingAfterBreak="0">
     <w:nsid w:val="52CA5321"/>
     <w:multiLevelType w:val="multilevel"/>
     <w:tmpl w:val="A5789A90"/>
@@ -18581,7 +19738,7 @@
       </w:rPr>
     </w:lvl>
   </w:abstractNum>
-  <w:abstractNum w:abstractNumId="119" w15:restartNumberingAfterBreak="0">
+  <w:abstractNum w:abstractNumId="122" w15:restartNumberingAfterBreak="0">
     <w:nsid w:val="54934925"/>
     <w:multiLevelType w:val="multilevel"/>
     <w:tmpl w:val="98CC5222"/>
@@ -18726,7 +19883,7 @@
       </w:rPr>
     </w:lvl>
   </w:abstractNum>
-  <w:abstractNum w:abstractNumId="120" w15:restartNumberingAfterBreak="0">
+  <w:abstractNum w:abstractNumId="123" w15:restartNumberingAfterBreak="0">
     <w:nsid w:val="56577CA2"/>
     <w:multiLevelType w:val="multilevel"/>
     <w:tmpl w:val="3B464D96"/>
@@ -18875,7 +20032,7 @@
       </w:rPr>
     </w:lvl>
   </w:abstractNum>
-  <w:abstractNum w:abstractNumId="121" w15:restartNumberingAfterBreak="0">
+  <w:abstractNum w:abstractNumId="124" w15:restartNumberingAfterBreak="0">
     <w:nsid w:val="569559BD"/>
     <w:multiLevelType w:val="multilevel"/>
     <w:tmpl w:val="C5ACF636"/>
@@ -19020,7 +20177,7 @@
       </w:rPr>
     </w:lvl>
   </w:abstractNum>
-  <w:abstractNum w:abstractNumId="122" w15:restartNumberingAfterBreak="0">
+  <w:abstractNum w:abstractNumId="125" w15:restartNumberingAfterBreak="0">
     <w:nsid w:val="58337005"/>
     <w:multiLevelType w:val="multilevel"/>
     <w:tmpl w:val="67BE8296"/>
@@ -19169,7 +20326,7 @@
       </w:rPr>
     </w:lvl>
   </w:abstractNum>
-  <w:abstractNum w:abstractNumId="123" w15:restartNumberingAfterBreak="0">
+  <w:abstractNum w:abstractNumId="126" w15:restartNumberingAfterBreak="0">
     <w:nsid w:val="588A7022"/>
     <w:multiLevelType w:val="multilevel"/>
     <w:tmpl w:val="209098E6"/>
@@ -19314,7 +20471,7 @@
       </w:rPr>
     </w:lvl>
   </w:abstractNum>
-  <w:abstractNum w:abstractNumId="124" w15:restartNumberingAfterBreak="0">
+  <w:abstractNum w:abstractNumId="127" w15:restartNumberingAfterBreak="0">
     <w:nsid w:val="595C6917"/>
     <w:multiLevelType w:val="multilevel"/>
     <w:tmpl w:val="C0D2BDCC"/>
@@ -19463,7 +20620,7 @@
       </w:rPr>
     </w:lvl>
   </w:abstractNum>
-  <w:abstractNum w:abstractNumId="125" w15:restartNumberingAfterBreak="0">
+  <w:abstractNum w:abstractNumId="128" w15:restartNumberingAfterBreak="0">
     <w:nsid w:val="59D6380F"/>
     <w:multiLevelType w:val="multilevel"/>
     <w:tmpl w:val="CCEAB946"/>
@@ -19612,7 +20769,7 @@
       </w:rPr>
     </w:lvl>
   </w:abstractNum>
-  <w:abstractNum w:abstractNumId="126" w15:restartNumberingAfterBreak="0">
+  <w:abstractNum w:abstractNumId="129" w15:restartNumberingAfterBreak="0">
     <w:nsid w:val="5A180965"/>
     <w:multiLevelType w:val="multilevel"/>
     <w:tmpl w:val="368E7656"/>
@@ -19761,7 +20918,7 @@
       </w:rPr>
     </w:lvl>
   </w:abstractNum>
-  <w:abstractNum w:abstractNumId="127" w15:restartNumberingAfterBreak="0">
+  <w:abstractNum w:abstractNumId="130" w15:restartNumberingAfterBreak="0">
     <w:nsid w:val="5A1E6C22"/>
     <w:multiLevelType w:val="multilevel"/>
     <w:tmpl w:val="4C5A959C"/>
@@ -19910,7 +21067,7 @@
       </w:rPr>
     </w:lvl>
   </w:abstractNum>
-  <w:abstractNum w:abstractNumId="128" w15:restartNumberingAfterBreak="0">
+  <w:abstractNum w:abstractNumId="131" w15:restartNumberingAfterBreak="0">
     <w:nsid w:val="5A967845"/>
     <w:multiLevelType w:val="multilevel"/>
     <w:tmpl w:val="671291B0"/>
@@ -20059,7 +21216,7 @@
       </w:rPr>
     </w:lvl>
   </w:abstractNum>
-  <w:abstractNum w:abstractNumId="129" w15:restartNumberingAfterBreak="0">
+  <w:abstractNum w:abstractNumId="132" w15:restartNumberingAfterBreak="0">
     <w:nsid w:val="5AF5226D"/>
     <w:multiLevelType w:val="multilevel"/>
     <w:tmpl w:val="B99AC694"/>
@@ -20172,7 +21329,7 @@
       </w:pPr>
     </w:lvl>
   </w:abstractNum>
-  <w:abstractNum w:abstractNumId="130" w15:restartNumberingAfterBreak="0">
+  <w:abstractNum w:abstractNumId="133" w15:restartNumberingAfterBreak="0">
     <w:nsid w:val="5AF5307D"/>
     <w:multiLevelType w:val="multilevel"/>
     <w:tmpl w:val="E8A4830C"/>
@@ -20321,7 +21478,7 @@
       </w:rPr>
     </w:lvl>
   </w:abstractNum>
-  <w:abstractNum w:abstractNumId="131" w15:restartNumberingAfterBreak="0">
+  <w:abstractNum w:abstractNumId="134" w15:restartNumberingAfterBreak="0">
     <w:nsid w:val="5BEC45E3"/>
     <w:multiLevelType w:val="multilevel"/>
     <w:tmpl w:val="BFEEBEA6"/>
@@ -20466,7 +21623,7 @@
       </w:rPr>
     </w:lvl>
   </w:abstractNum>
-  <w:abstractNum w:abstractNumId="132" w15:restartNumberingAfterBreak="0">
+  <w:abstractNum w:abstractNumId="135" w15:restartNumberingAfterBreak="0">
     <w:nsid w:val="5C351A04"/>
     <w:multiLevelType w:val="multilevel"/>
     <w:tmpl w:val="A454A842"/>
@@ -20611,7 +21768,7 @@
       </w:rPr>
     </w:lvl>
   </w:abstractNum>
-  <w:abstractNum w:abstractNumId="133" w15:restartNumberingAfterBreak="0">
+  <w:abstractNum w:abstractNumId="136" w15:restartNumberingAfterBreak="0">
     <w:nsid w:val="5C875E9E"/>
     <w:multiLevelType w:val="multilevel"/>
     <w:tmpl w:val="1E50267A"/>
@@ -20760,7 +21917,7 @@
       </w:rPr>
     </w:lvl>
   </w:abstractNum>
-  <w:abstractNum w:abstractNumId="134" w15:restartNumberingAfterBreak="0">
+  <w:abstractNum w:abstractNumId="137" w15:restartNumberingAfterBreak="0">
     <w:nsid w:val="5EB92979"/>
     <w:multiLevelType w:val="multilevel"/>
     <w:tmpl w:val="6596B810"/>
@@ -20909,7 +22066,7 @@
       </w:rPr>
     </w:lvl>
   </w:abstractNum>
-  <w:abstractNum w:abstractNumId="135" w15:restartNumberingAfterBreak="0">
+  <w:abstractNum w:abstractNumId="138" w15:restartNumberingAfterBreak="0">
     <w:nsid w:val="5EE830EE"/>
     <w:multiLevelType w:val="multilevel"/>
     <w:tmpl w:val="94A28B36"/>
@@ -21054,7 +22211,7 @@
       </w:rPr>
     </w:lvl>
   </w:abstractNum>
-  <w:abstractNum w:abstractNumId="136" w15:restartNumberingAfterBreak="0">
+  <w:abstractNum w:abstractNumId="139" w15:restartNumberingAfterBreak="0">
     <w:nsid w:val="5F115C9A"/>
     <w:multiLevelType w:val="multilevel"/>
     <w:tmpl w:val="9F6429B0"/>
@@ -21167,7 +22324,7 @@
       </w:pPr>
     </w:lvl>
   </w:abstractNum>
-  <w:abstractNum w:abstractNumId="137" w15:restartNumberingAfterBreak="0">
+  <w:abstractNum w:abstractNumId="140" w15:restartNumberingAfterBreak="0">
     <w:nsid w:val="5F697C42"/>
     <w:multiLevelType w:val="multilevel"/>
     <w:tmpl w:val="9DC4083C"/>
@@ -21316,7 +22473,7 @@
       </w:rPr>
     </w:lvl>
   </w:abstractNum>
-  <w:abstractNum w:abstractNumId="138" w15:restartNumberingAfterBreak="0">
+  <w:abstractNum w:abstractNumId="141" w15:restartNumberingAfterBreak="0">
     <w:nsid w:val="60F905B2"/>
     <w:multiLevelType w:val="multilevel"/>
     <w:tmpl w:val="67242AE0"/>
@@ -21465,7 +22622,7 @@
       </w:rPr>
     </w:lvl>
   </w:abstractNum>
-  <w:abstractNum w:abstractNumId="139" w15:restartNumberingAfterBreak="0">
+  <w:abstractNum w:abstractNumId="142" w15:restartNumberingAfterBreak="0">
     <w:nsid w:val="612E77DC"/>
     <w:multiLevelType w:val="multilevel"/>
     <w:tmpl w:val="022496D4"/>
@@ -21614,7 +22771,7 @@
       </w:rPr>
     </w:lvl>
   </w:abstractNum>
-  <w:abstractNum w:abstractNumId="140" w15:restartNumberingAfterBreak="0">
+  <w:abstractNum w:abstractNumId="143" w15:restartNumberingAfterBreak="0">
     <w:nsid w:val="63CF35A4"/>
     <w:multiLevelType w:val="multilevel"/>
     <w:tmpl w:val="1B76D1E2"/>
@@ -21731,7 +22888,7 @@
       </w:pPr>
     </w:lvl>
   </w:abstractNum>
-  <w:abstractNum w:abstractNumId="141" w15:restartNumberingAfterBreak="0">
+  <w:abstractNum w:abstractNumId="144" w15:restartNumberingAfterBreak="0">
     <w:nsid w:val="6542530D"/>
     <w:multiLevelType w:val="multilevel"/>
     <w:tmpl w:val="E4CE3122"/>
@@ -21880,7 +23037,7 @@
       </w:rPr>
     </w:lvl>
   </w:abstractNum>
-  <w:abstractNum w:abstractNumId="142" w15:restartNumberingAfterBreak="0">
+  <w:abstractNum w:abstractNumId="145" w15:restartNumberingAfterBreak="0">
     <w:nsid w:val="67712178"/>
     <w:multiLevelType w:val="multilevel"/>
     <w:tmpl w:val="763E8398"/>
@@ -22025,7 +23182,7 @@
       </w:rPr>
     </w:lvl>
   </w:abstractNum>
-  <w:abstractNum w:abstractNumId="143" w15:restartNumberingAfterBreak="0">
+  <w:abstractNum w:abstractNumId="146" w15:restartNumberingAfterBreak="0">
     <w:nsid w:val="67FE3CF3"/>
     <w:multiLevelType w:val="multilevel"/>
     <w:tmpl w:val="F0EA03EE"/>
@@ -22174,7 +23331,7 @@
       </w:rPr>
     </w:lvl>
   </w:abstractNum>
-  <w:abstractNum w:abstractNumId="144" w15:restartNumberingAfterBreak="0">
+  <w:abstractNum w:abstractNumId="147" w15:restartNumberingAfterBreak="0">
     <w:nsid w:val="68346FCA"/>
     <w:multiLevelType w:val="multilevel"/>
     <w:tmpl w:val="F5624ABA"/>
@@ -22323,7 +23480,7 @@
       </w:rPr>
     </w:lvl>
   </w:abstractNum>
-  <w:abstractNum w:abstractNumId="145" w15:restartNumberingAfterBreak="0">
+  <w:abstractNum w:abstractNumId="148" w15:restartNumberingAfterBreak="0">
     <w:nsid w:val="684D1C7E"/>
     <w:multiLevelType w:val="multilevel"/>
     <w:tmpl w:val="8C26FD92"/>
@@ -22472,7 +23629,7 @@
       </w:rPr>
     </w:lvl>
   </w:abstractNum>
-  <w:abstractNum w:abstractNumId="146" w15:restartNumberingAfterBreak="0">
+  <w:abstractNum w:abstractNumId="149" w15:restartNumberingAfterBreak="0">
     <w:nsid w:val="691B7355"/>
     <w:multiLevelType w:val="multilevel"/>
     <w:tmpl w:val="8988CDE0"/>
@@ -22617,7 +23774,7 @@
       </w:rPr>
     </w:lvl>
   </w:abstractNum>
-  <w:abstractNum w:abstractNumId="147" w15:restartNumberingAfterBreak="0">
+  <w:abstractNum w:abstractNumId="150" w15:restartNumberingAfterBreak="0">
     <w:nsid w:val="69B8059F"/>
     <w:multiLevelType w:val="multilevel"/>
     <w:tmpl w:val="9AC2858C"/>
@@ -22766,7 +23923,7 @@
       </w:rPr>
     </w:lvl>
   </w:abstractNum>
-  <w:abstractNum w:abstractNumId="148" w15:restartNumberingAfterBreak="0">
+  <w:abstractNum w:abstractNumId="151" w15:restartNumberingAfterBreak="0">
     <w:nsid w:val="6AD65718"/>
     <w:multiLevelType w:val="multilevel"/>
     <w:tmpl w:val="FCAC18C2"/>
@@ -22915,7 +24072,7 @@
       </w:rPr>
     </w:lvl>
   </w:abstractNum>
-  <w:abstractNum w:abstractNumId="149" w15:restartNumberingAfterBreak="0">
+  <w:abstractNum w:abstractNumId="152" w15:restartNumberingAfterBreak="0">
     <w:nsid w:val="6B8A6220"/>
     <w:multiLevelType w:val="multilevel"/>
     <w:tmpl w:val="5C163B7A"/>
@@ -23028,7 +24185,7 @@
       </w:pPr>
     </w:lvl>
   </w:abstractNum>
-  <w:abstractNum w:abstractNumId="150" w15:restartNumberingAfterBreak="0">
+  <w:abstractNum w:abstractNumId="153" w15:restartNumberingAfterBreak="0">
     <w:nsid w:val="6BD06AC3"/>
     <w:multiLevelType w:val="multilevel"/>
     <w:tmpl w:val="0E88B312"/>
@@ -23173,7 +24330,7 @@
       </w:rPr>
     </w:lvl>
   </w:abstractNum>
-  <w:abstractNum w:abstractNumId="151" w15:restartNumberingAfterBreak="0">
+  <w:abstractNum w:abstractNumId="154" w15:restartNumberingAfterBreak="0">
     <w:nsid w:val="6BEB67DB"/>
     <w:multiLevelType w:val="multilevel"/>
     <w:tmpl w:val="35F42B3E"/>
@@ -23322,7 +24479,7 @@
       </w:rPr>
     </w:lvl>
   </w:abstractNum>
-  <w:abstractNum w:abstractNumId="152" w15:restartNumberingAfterBreak="0">
+  <w:abstractNum w:abstractNumId="155" w15:restartNumberingAfterBreak="0">
     <w:nsid w:val="6C233DA4"/>
     <w:multiLevelType w:val="multilevel"/>
     <w:tmpl w:val="D88290E8"/>
@@ -23471,7 +24628,7 @@
       </w:rPr>
     </w:lvl>
   </w:abstractNum>
-  <w:abstractNum w:abstractNumId="153" w15:restartNumberingAfterBreak="0">
+  <w:abstractNum w:abstractNumId="156" w15:restartNumberingAfterBreak="0">
     <w:nsid w:val="6D4B14EF"/>
     <w:multiLevelType w:val="multilevel"/>
     <w:tmpl w:val="90DE3E0C"/>
@@ -23620,7 +24777,7 @@
       </w:rPr>
     </w:lvl>
   </w:abstractNum>
-  <w:abstractNum w:abstractNumId="154" w15:restartNumberingAfterBreak="0">
+  <w:abstractNum w:abstractNumId="157" w15:restartNumberingAfterBreak="0">
     <w:nsid w:val="6DD97F7B"/>
     <w:multiLevelType w:val="multilevel"/>
     <w:tmpl w:val="AC8ACFF4"/>
@@ -23769,7 +24926,7 @@
       </w:rPr>
     </w:lvl>
   </w:abstractNum>
-  <w:abstractNum w:abstractNumId="155" w15:restartNumberingAfterBreak="0">
+  <w:abstractNum w:abstractNumId="158" w15:restartNumberingAfterBreak="0">
     <w:nsid w:val="6DF23E49"/>
     <w:multiLevelType w:val="multilevel"/>
     <w:tmpl w:val="6BCA895E"/>
@@ -23882,7 +25039,7 @@
       </w:pPr>
     </w:lvl>
   </w:abstractNum>
-  <w:abstractNum w:abstractNumId="156" w15:restartNumberingAfterBreak="0">
+  <w:abstractNum w:abstractNumId="159" w15:restartNumberingAfterBreak="0">
     <w:nsid w:val="6FD342C0"/>
     <w:multiLevelType w:val="multilevel"/>
     <w:tmpl w:val="187C8E1A"/>
@@ -24031,7 +25188,7 @@
       </w:rPr>
     </w:lvl>
   </w:abstractNum>
-  <w:abstractNum w:abstractNumId="157" w15:restartNumberingAfterBreak="0">
+  <w:abstractNum w:abstractNumId="160" w15:restartNumberingAfterBreak="0">
     <w:nsid w:val="706F1B6B"/>
     <w:multiLevelType w:val="multilevel"/>
     <w:tmpl w:val="371EF16A"/>
@@ -24180,7 +25337,7 @@
       </w:rPr>
     </w:lvl>
   </w:abstractNum>
-  <w:abstractNum w:abstractNumId="158" w15:restartNumberingAfterBreak="0">
+  <w:abstractNum w:abstractNumId="161" w15:restartNumberingAfterBreak="0">
     <w:nsid w:val="70D86182"/>
     <w:multiLevelType w:val="multilevel"/>
     <w:tmpl w:val="02387014"/>
@@ -24329,7 +25486,156 @@
       </w:rPr>
     </w:lvl>
   </w:abstractNum>
-  <w:abstractNum w:abstractNumId="159" w15:restartNumberingAfterBreak="0">
+  <w:abstractNum w:abstractNumId="162" w15:restartNumberingAfterBreak="0">
+    <w:nsid w:val="71052F53"/>
+    <w:multiLevelType w:val="multilevel"/>
+    <w:tmpl w:val="60CAB4A6"/>
+    <w:lvl w:ilvl="0">
+      <w:start w:val="1"/>
+      <w:numFmt w:val="bullet"/>
+      <w:lvlText w:val=""/>
+      <w:lvlJc w:val="left"/>
+      <w:pPr>
+        <w:tabs>
+          <w:tab w:val="num" w:pos="720"/>
+        </w:tabs>
+        <w:ind w:left="720" w:hanging="360"/>
+      </w:pPr>
+      <w:rPr>
+        <w:rFonts w:ascii="Symbol" w:hAnsi="Symbol" w:hint="default"/>
+        <w:sz w:val="20"/>
+      </w:rPr>
+    </w:lvl>
+    <w:lvl w:ilvl="1" w:tentative="1">
+      <w:start w:val="1"/>
+      <w:numFmt w:val="bullet"/>
+      <w:lvlText w:val="o"/>
+      <w:lvlJc w:val="left"/>
+      <w:pPr>
+        <w:tabs>
+          <w:tab w:val="num" w:pos="1440"/>
+        </w:tabs>
+        <w:ind w:left="1440" w:hanging="360"/>
+      </w:pPr>
+      <w:rPr>
+        <w:rFonts w:ascii="Courier New" w:hAnsi="Courier New" w:hint="default"/>
+        <w:sz w:val="20"/>
+      </w:rPr>
+    </w:lvl>
+    <w:lvl w:ilvl="2" w:tentative="1">
+      <w:start w:val="1"/>
+      <w:numFmt w:val="bullet"/>
+      <w:lvlText w:val=""/>
+      <w:lvlJc w:val="left"/>
+      <w:pPr>
+        <w:tabs>
+          <w:tab w:val="num" w:pos="2160"/>
+        </w:tabs>
+        <w:ind w:left="2160" w:hanging="360"/>
+      </w:pPr>
+      <w:rPr>
+        <w:rFonts w:ascii="Wingdings" w:hAnsi="Wingdings" w:hint="default"/>
+        <w:sz w:val="20"/>
+      </w:rPr>
+    </w:lvl>
+    <w:lvl w:ilvl="3" w:tentative="1">
+      <w:start w:val="1"/>
+      <w:numFmt w:val="bullet"/>
+      <w:lvlText w:val=""/>
+      <w:lvlJc w:val="left"/>
+      <w:pPr>
+        <w:tabs>
+          <w:tab w:val="num" w:pos="2880"/>
+        </w:tabs>
+        <w:ind w:left="2880" w:hanging="360"/>
+      </w:pPr>
+      <w:rPr>
+        <w:rFonts w:ascii="Wingdings" w:hAnsi="Wingdings" w:hint="default"/>
+        <w:sz w:val="20"/>
+      </w:rPr>
+    </w:lvl>
+    <w:lvl w:ilvl="4" w:tentative="1">
+      <w:start w:val="1"/>
+      <w:numFmt w:val="bullet"/>
+      <w:lvlText w:val=""/>
+      <w:lvlJc w:val="left"/>
+      <w:pPr>
+        <w:tabs>
+          <w:tab w:val="num" w:pos="3600"/>
+        </w:tabs>
+        <w:ind w:left="3600" w:hanging="360"/>
+      </w:pPr>
+      <w:rPr>
+        <w:rFonts w:ascii="Wingdings" w:hAnsi="Wingdings" w:hint="default"/>
+        <w:sz w:val="20"/>
+      </w:rPr>
+    </w:lvl>
+    <w:lvl w:ilvl="5" w:tentative="1">
+      <w:start w:val="1"/>
+      <w:numFmt w:val="bullet"/>
+      <w:lvlText w:val=""/>
+      <w:lvlJc w:val="left"/>
+      <w:pPr>
+        <w:tabs>
+          <w:tab w:val="num" w:pos="4320"/>
+        </w:tabs>
+        <w:ind w:left="4320" w:hanging="360"/>
+      </w:pPr>
+      <w:rPr>
+        <w:rFonts w:ascii="Wingdings" w:hAnsi="Wingdings" w:hint="default"/>
+        <w:sz w:val="20"/>
+      </w:rPr>
+    </w:lvl>
+    <w:lvl w:ilvl="6" w:tentative="1">
+      <w:start w:val="1"/>
+      <w:numFmt w:val="bullet"/>
+      <w:lvlText w:val=""/>
+      <w:lvlJc w:val="left"/>
+      <w:pPr>
+        <w:tabs>
+          <w:tab w:val="num" w:pos="5040"/>
+        </w:tabs>
+        <w:ind w:left="5040" w:hanging="360"/>
+      </w:pPr>
+      <w:rPr>
+        <w:rFonts w:ascii="Wingdings" w:hAnsi="Wingdings" w:hint="default"/>
+        <w:sz w:val="20"/>
+      </w:rPr>
+    </w:lvl>
+    <w:lvl w:ilvl="7" w:tentative="1">
+      <w:start w:val="1"/>
+      <w:numFmt w:val="bullet"/>
+      <w:lvlText w:val=""/>
+      <w:lvlJc w:val="left"/>
+      <w:pPr>
+        <w:tabs>
+          <w:tab w:val="num" w:pos="5760"/>
+        </w:tabs>
+        <w:ind w:left="5760" w:hanging="360"/>
+      </w:pPr>
+      <w:rPr>
+        <w:rFonts w:ascii="Wingdings" w:hAnsi="Wingdings" w:hint="default"/>
+        <w:sz w:val="20"/>
+      </w:rPr>
+    </w:lvl>
+    <w:lvl w:ilvl="8" w:tentative="1">
+      <w:start w:val="1"/>
+      <w:numFmt w:val="bullet"/>
+      <w:lvlText w:val=""/>
+      <w:lvlJc w:val="left"/>
+      <w:pPr>
+        <w:tabs>
+          <w:tab w:val="num" w:pos="6480"/>
+        </w:tabs>
+        <w:ind w:left="6480" w:hanging="360"/>
+      </w:pPr>
+      <w:rPr>
+        <w:rFonts w:ascii="Wingdings" w:hAnsi="Wingdings" w:hint="default"/>
+        <w:sz w:val="20"/>
+      </w:rPr>
+    </w:lvl>
+  </w:abstractNum>
+  <w:abstractNum w:abstractNumId="163" w15:restartNumberingAfterBreak="0">
     <w:nsid w:val="71D37AAF"/>
     <w:multiLevelType w:val="multilevel"/>
     <w:tmpl w:val="B2B200B6"/>
@@ -24446,7 +25752,7 @@
       </w:pPr>
     </w:lvl>
   </w:abstractNum>
-  <w:abstractNum w:abstractNumId="160" w15:restartNumberingAfterBreak="0">
+  <w:abstractNum w:abstractNumId="164" w15:restartNumberingAfterBreak="0">
     <w:nsid w:val="722A05EF"/>
     <w:multiLevelType w:val="multilevel"/>
     <w:tmpl w:val="9D4017A0"/>
@@ -24591,7 +25897,7 @@
       </w:rPr>
     </w:lvl>
   </w:abstractNum>
-  <w:abstractNum w:abstractNumId="161" w15:restartNumberingAfterBreak="0">
+  <w:abstractNum w:abstractNumId="165" w15:restartNumberingAfterBreak="0">
     <w:nsid w:val="722C5724"/>
     <w:multiLevelType w:val="multilevel"/>
     <w:tmpl w:val="AFD87044"/>
@@ -24740,7 +26046,7 @@
       </w:rPr>
     </w:lvl>
   </w:abstractNum>
-  <w:abstractNum w:abstractNumId="162" w15:restartNumberingAfterBreak="0">
+  <w:abstractNum w:abstractNumId="166" w15:restartNumberingAfterBreak="0">
     <w:nsid w:val="72AB4EA6"/>
     <w:multiLevelType w:val="multilevel"/>
     <w:tmpl w:val="F57056C6"/>
@@ -24889,7 +26195,7 @@
       </w:rPr>
     </w:lvl>
   </w:abstractNum>
-  <w:abstractNum w:abstractNumId="163" w15:restartNumberingAfterBreak="0">
+  <w:abstractNum w:abstractNumId="167" w15:restartNumberingAfterBreak="0">
     <w:nsid w:val="75657497"/>
     <w:multiLevelType w:val="multilevel"/>
     <w:tmpl w:val="10B8BB48"/>
@@ -25038,7 +26344,7 @@
       </w:rPr>
     </w:lvl>
   </w:abstractNum>
-  <w:abstractNum w:abstractNumId="164" w15:restartNumberingAfterBreak="0">
+  <w:abstractNum w:abstractNumId="168" w15:restartNumberingAfterBreak="0">
     <w:nsid w:val="7784607C"/>
     <w:multiLevelType w:val="multilevel"/>
     <w:tmpl w:val="605C0276"/>
@@ -25187,7 +26493,7 @@
       </w:rPr>
     </w:lvl>
   </w:abstractNum>
-  <w:abstractNum w:abstractNumId="165" w15:restartNumberingAfterBreak="0">
+  <w:abstractNum w:abstractNumId="169" w15:restartNumberingAfterBreak="0">
     <w:nsid w:val="78A22134"/>
     <w:multiLevelType w:val="multilevel"/>
     <w:tmpl w:val="073E2A9E"/>
@@ -25336,7 +26642,7 @@
       </w:rPr>
     </w:lvl>
   </w:abstractNum>
-  <w:abstractNum w:abstractNumId="166" w15:restartNumberingAfterBreak="0">
+  <w:abstractNum w:abstractNumId="170" w15:restartNumberingAfterBreak="0">
     <w:nsid w:val="78C02082"/>
     <w:multiLevelType w:val="multilevel"/>
     <w:tmpl w:val="8D0C7626"/>
@@ -25449,7 +26755,7 @@
       </w:pPr>
     </w:lvl>
   </w:abstractNum>
-  <w:abstractNum w:abstractNumId="167" w15:restartNumberingAfterBreak="0">
+  <w:abstractNum w:abstractNumId="171" w15:restartNumberingAfterBreak="0">
     <w:nsid w:val="79730047"/>
     <w:multiLevelType w:val="multilevel"/>
     <w:tmpl w:val="89A40416"/>
@@ -25562,7 +26868,7 @@
       </w:pPr>
     </w:lvl>
   </w:abstractNum>
-  <w:abstractNum w:abstractNumId="168" w15:restartNumberingAfterBreak="0">
+  <w:abstractNum w:abstractNumId="172" w15:restartNumberingAfterBreak="0">
     <w:nsid w:val="7A1E3625"/>
     <w:multiLevelType w:val="multilevel"/>
     <w:tmpl w:val="ED7C47AA"/>
@@ -25679,7 +26985,7 @@
       </w:pPr>
     </w:lvl>
   </w:abstractNum>
-  <w:abstractNum w:abstractNumId="169" w15:restartNumberingAfterBreak="0">
+  <w:abstractNum w:abstractNumId="173" w15:restartNumberingAfterBreak="0">
     <w:nsid w:val="7B5E061D"/>
     <w:multiLevelType w:val="multilevel"/>
     <w:tmpl w:val="680E5C16"/>
@@ -25828,7 +27134,7 @@
       </w:rPr>
     </w:lvl>
   </w:abstractNum>
-  <w:abstractNum w:abstractNumId="170" w15:restartNumberingAfterBreak="0">
+  <w:abstractNum w:abstractNumId="174" w15:restartNumberingAfterBreak="0">
     <w:nsid w:val="7CAB0C2F"/>
     <w:multiLevelType w:val="multilevel"/>
     <w:tmpl w:val="562684C8"/>
@@ -25977,7 +27283,7 @@
       </w:rPr>
     </w:lvl>
   </w:abstractNum>
-  <w:abstractNum w:abstractNumId="171" w15:restartNumberingAfterBreak="0">
+  <w:abstractNum w:abstractNumId="175" w15:restartNumberingAfterBreak="0">
     <w:nsid w:val="7D811F66"/>
     <w:multiLevelType w:val="multilevel"/>
     <w:tmpl w:val="6510AC00"/>
@@ -26126,7 +27432,7 @@
       </w:rPr>
     </w:lvl>
   </w:abstractNum>
-  <w:abstractNum w:abstractNumId="172" w15:restartNumberingAfterBreak="0">
+  <w:abstractNum w:abstractNumId="176" w15:restartNumberingAfterBreak="0">
     <w:nsid w:val="7E5315A9"/>
     <w:multiLevelType w:val="multilevel"/>
     <w:tmpl w:val="63760288"/>
@@ -26243,7 +27549,7 @@
       </w:pPr>
     </w:lvl>
   </w:abstractNum>
-  <w:abstractNum w:abstractNumId="173" w15:restartNumberingAfterBreak="0">
+  <w:abstractNum w:abstractNumId="177" w15:restartNumberingAfterBreak="0">
     <w:nsid w:val="7E845D03"/>
     <w:multiLevelType w:val="multilevel"/>
     <w:tmpl w:val="22FA3D84"/>
@@ -26392,7 +27698,7 @@
       </w:rPr>
     </w:lvl>
   </w:abstractNum>
-  <w:abstractNum w:abstractNumId="174" w15:restartNumberingAfterBreak="0">
+  <w:abstractNum w:abstractNumId="178" w15:restartNumberingAfterBreak="0">
     <w:nsid w:val="7F9A1358"/>
     <w:multiLevelType w:val="multilevel"/>
     <w:tmpl w:val="818C7948"/>
@@ -26506,7 +27812,7 @@
     </w:lvl>
   </w:abstractNum>
   <w:num w:numId="1" w16cid:durableId="30304640">
-    <w:abstractNumId w:val="127"/>
+    <w:abstractNumId w:val="130"/>
   </w:num>
   <w:num w:numId="2" w16cid:durableId="131679990">
     <w:abstractNumId w:val="39"/>
@@ -26515,7 +27821,7 @@
     <w:abstractNumId w:val="89"/>
   </w:num>
   <w:num w:numId="4" w16cid:durableId="956788891">
-    <w:abstractNumId w:val="107"/>
+    <w:abstractNumId w:val="110"/>
   </w:num>
   <w:num w:numId="5" w16cid:durableId="1318801211">
     <w:abstractNumId w:val="94"/>
@@ -26524,40 +27830,40 @@
     <w:abstractNumId w:val="92"/>
   </w:num>
   <w:num w:numId="7" w16cid:durableId="1380788396">
-    <w:abstractNumId w:val="101"/>
+    <w:abstractNumId w:val="103"/>
   </w:num>
   <w:num w:numId="8" w16cid:durableId="1435594655">
     <w:abstractNumId w:val="9"/>
   </w:num>
   <w:num w:numId="9" w16cid:durableId="468284279">
-    <w:abstractNumId w:val="165"/>
+    <w:abstractNumId w:val="169"/>
   </w:num>
   <w:num w:numId="10" w16cid:durableId="1801537932">
-    <w:abstractNumId w:val="164"/>
+    <w:abstractNumId w:val="168"/>
   </w:num>
   <w:num w:numId="11" w16cid:durableId="1292319018">
-    <w:abstractNumId w:val="114"/>
+    <w:abstractNumId w:val="117"/>
   </w:num>
   <w:num w:numId="12" w16cid:durableId="1330595449">
-    <w:abstractNumId w:val="113"/>
+    <w:abstractNumId w:val="116"/>
   </w:num>
   <w:num w:numId="13" w16cid:durableId="1978413072">
-    <w:abstractNumId w:val="105"/>
+    <w:abstractNumId w:val="108"/>
   </w:num>
   <w:num w:numId="14" w16cid:durableId="806052255">
-    <w:abstractNumId w:val="155"/>
+    <w:abstractNumId w:val="158"/>
   </w:num>
   <w:num w:numId="15" w16cid:durableId="2104833335">
-    <w:abstractNumId w:val="157"/>
+    <w:abstractNumId w:val="160"/>
   </w:num>
   <w:num w:numId="16" w16cid:durableId="36244815">
     <w:abstractNumId w:val="87"/>
   </w:num>
   <w:num w:numId="17" w16cid:durableId="1400398143">
-    <w:abstractNumId w:val="103"/>
+    <w:abstractNumId w:val="106"/>
   </w:num>
   <w:num w:numId="18" w16cid:durableId="773331749">
-    <w:abstractNumId w:val="173"/>
+    <w:abstractNumId w:val="177"/>
   </w:num>
   <w:num w:numId="19" w16cid:durableId="791021393">
     <w:abstractNumId w:val="47"/>
@@ -26575,10 +27881,10 @@
     <w:abstractNumId w:val="12"/>
   </w:num>
   <w:num w:numId="24" w16cid:durableId="561647625">
-    <w:abstractNumId w:val="135"/>
+    <w:abstractNumId w:val="138"/>
   </w:num>
   <w:num w:numId="25" w16cid:durableId="602147053">
-    <w:abstractNumId w:val="140"/>
+    <w:abstractNumId w:val="143"/>
   </w:num>
   <w:num w:numId="26" w16cid:durableId="645671251">
     <w:abstractNumId w:val="46"/>
@@ -26594,16 +27900,16 @@
     </w:lvlOverride>
   </w:num>
   <w:num w:numId="28" w16cid:durableId="2012875563">
-    <w:abstractNumId w:val="130"/>
+    <w:abstractNumId w:val="133"/>
   </w:num>
   <w:num w:numId="29" w16cid:durableId="428089704">
     <w:abstractNumId w:val="32"/>
   </w:num>
   <w:num w:numId="30" w16cid:durableId="410931569">
-    <w:abstractNumId w:val="123"/>
+    <w:abstractNumId w:val="126"/>
   </w:num>
   <w:num w:numId="31" w16cid:durableId="819882765">
-    <w:abstractNumId w:val="123"/>
+    <w:abstractNumId w:val="126"/>
     <w:lvlOverride w:ilvl="1">
       <w:lvl w:ilvl="1">
         <w:numFmt w:val="bullet"/>
@@ -26623,16 +27929,16 @@
     </w:lvlOverride>
   </w:num>
   <w:num w:numId="32" w16cid:durableId="1979919899">
-    <w:abstractNumId w:val="134"/>
+    <w:abstractNumId w:val="137"/>
   </w:num>
   <w:num w:numId="33" w16cid:durableId="650063522">
-    <w:abstractNumId w:val="154"/>
+    <w:abstractNumId w:val="157"/>
   </w:num>
   <w:num w:numId="34" w16cid:durableId="1829176748">
     <w:abstractNumId w:val="84"/>
   </w:num>
   <w:num w:numId="35" w16cid:durableId="599877971">
-    <w:abstractNumId w:val="148"/>
+    <w:abstractNumId w:val="151"/>
   </w:num>
   <w:num w:numId="36" w16cid:durableId="1571841508">
     <w:abstractNumId w:val="73"/>
@@ -26658,19 +27964,19 @@
     </w:lvlOverride>
   </w:num>
   <w:num w:numId="38" w16cid:durableId="919680886">
-    <w:abstractNumId w:val="119"/>
+    <w:abstractNumId w:val="122"/>
   </w:num>
   <w:num w:numId="39" w16cid:durableId="1682001463">
+    <w:abstractNumId w:val="150"/>
+  </w:num>
+  <w:num w:numId="40" w16cid:durableId="175849549">
     <w:abstractNumId w:val="147"/>
   </w:num>
-  <w:num w:numId="40" w16cid:durableId="175849549">
-    <w:abstractNumId w:val="144"/>
-  </w:num>
   <w:num w:numId="41" w16cid:durableId="1617180450">
-    <w:abstractNumId w:val="97"/>
+    <w:abstractNumId w:val="98"/>
   </w:num>
   <w:num w:numId="42" w16cid:durableId="361367430">
-    <w:abstractNumId w:val="97"/>
+    <w:abstractNumId w:val="98"/>
     <w:lvlOverride w:ilvl="1">
       <w:lvl w:ilvl="1">
         <w:numFmt w:val="bullet"/>
@@ -26728,16 +28034,16 @@
     <w:abstractNumId w:val="6"/>
   </w:num>
   <w:num w:numId="50" w16cid:durableId="1930918386">
-    <w:abstractNumId w:val="108"/>
+    <w:abstractNumId w:val="111"/>
   </w:num>
   <w:num w:numId="51" w16cid:durableId="209197328">
-    <w:abstractNumId w:val="121"/>
+    <w:abstractNumId w:val="124"/>
   </w:num>
   <w:num w:numId="52" w16cid:durableId="697435575">
-    <w:abstractNumId w:val="98"/>
+    <w:abstractNumId w:val="99"/>
   </w:num>
   <w:num w:numId="53" w16cid:durableId="582766624">
-    <w:abstractNumId w:val="169"/>
+    <w:abstractNumId w:val="173"/>
   </w:num>
   <w:num w:numId="54" w16cid:durableId="830023098">
     <w:abstractNumId w:val="78"/>
@@ -26766,7 +28072,7 @@
     <w:abstractNumId w:val="60"/>
   </w:num>
   <w:num w:numId="57" w16cid:durableId="1606956943">
-    <w:abstractNumId w:val="152"/>
+    <w:abstractNumId w:val="155"/>
   </w:num>
   <w:num w:numId="58" w16cid:durableId="1840383666">
     <w:abstractNumId w:val="57"/>
@@ -26778,10 +28084,10 @@
     <w:abstractNumId w:val="56"/>
   </w:num>
   <w:num w:numId="61" w16cid:durableId="779489446">
-    <w:abstractNumId w:val="151"/>
+    <w:abstractNumId w:val="154"/>
   </w:num>
   <w:num w:numId="62" w16cid:durableId="2096628128">
-    <w:abstractNumId w:val="156"/>
+    <w:abstractNumId w:val="159"/>
   </w:num>
   <w:num w:numId="63" w16cid:durableId="1257978311">
     <w:abstractNumId w:val="14"/>
@@ -26796,10 +28102,10 @@
     <w:abstractNumId w:val="63"/>
   </w:num>
   <w:num w:numId="66" w16cid:durableId="1697807086">
-    <w:abstractNumId w:val="136"/>
+    <w:abstractNumId w:val="139"/>
   </w:num>
   <w:num w:numId="67" w16cid:durableId="1418672027">
-    <w:abstractNumId w:val="102"/>
+    <w:abstractNumId w:val="104"/>
   </w:num>
   <w:num w:numId="68" w16cid:durableId="91168919">
     <w:abstractNumId w:val="52"/>
@@ -26831,13 +28137,13 @@
     <w:abstractNumId w:val="18"/>
   </w:num>
   <w:num w:numId="72" w16cid:durableId="1766876056">
-    <w:abstractNumId w:val="129"/>
+    <w:abstractNumId w:val="132"/>
   </w:num>
   <w:num w:numId="73" w16cid:durableId="929197985">
-    <w:abstractNumId w:val="150"/>
+    <w:abstractNumId w:val="153"/>
   </w:num>
   <w:num w:numId="74" w16cid:durableId="406078978">
-    <w:abstractNumId w:val="150"/>
+    <w:abstractNumId w:val="153"/>
     <w:lvlOverride w:ilvl="1">
       <w:lvl w:ilvl="1">
         <w:numFmt w:val="bullet"/>
@@ -26857,7 +28163,7 @@
     </w:lvlOverride>
   </w:num>
   <w:num w:numId="75" w16cid:durableId="1260987308">
-    <w:abstractNumId w:val="150"/>
+    <w:abstractNumId w:val="153"/>
     <w:lvlOverride w:ilvl="1">
       <w:lvl w:ilvl="1">
         <w:numFmt w:val="bullet"/>
@@ -26880,7 +28186,7 @@
     <w:abstractNumId w:val="77"/>
   </w:num>
   <w:num w:numId="77" w16cid:durableId="526450885">
-    <w:abstractNumId w:val="138"/>
+    <w:abstractNumId w:val="141"/>
   </w:num>
   <w:num w:numId="78" w16cid:durableId="1324964506">
     <w:abstractNumId w:val="49"/>
@@ -26923,7 +28229,7 @@
     <w:abstractNumId w:val="67"/>
   </w:num>
   <w:num w:numId="89" w16cid:durableId="327559367">
-    <w:abstractNumId w:val="115"/>
+    <w:abstractNumId w:val="118"/>
   </w:num>
   <w:num w:numId="90" w16cid:durableId="41368198">
     <w:abstractNumId w:val="41"/>
@@ -26981,10 +28287,10 @@
     <w:abstractNumId w:val="74"/>
   </w:num>
   <w:num w:numId="97" w16cid:durableId="1213418878">
-    <w:abstractNumId w:val="106"/>
+    <w:abstractNumId w:val="109"/>
   </w:num>
   <w:num w:numId="98" w16cid:durableId="1310596252">
-    <w:abstractNumId w:val="160"/>
+    <w:abstractNumId w:val="164"/>
   </w:num>
   <w:num w:numId="99" w16cid:durableId="1261528361">
     <w:abstractNumId w:val="66"/>
@@ -26993,16 +28299,16 @@
     <w:abstractNumId w:val="65"/>
   </w:num>
   <w:num w:numId="101" w16cid:durableId="1037898143">
-    <w:abstractNumId w:val="128"/>
+    <w:abstractNumId w:val="131"/>
   </w:num>
   <w:num w:numId="102" w16cid:durableId="1515802033">
-    <w:abstractNumId w:val="96"/>
+    <w:abstractNumId w:val="97"/>
   </w:num>
   <w:num w:numId="103" w16cid:durableId="1335262094">
-    <w:abstractNumId w:val="159"/>
+    <w:abstractNumId w:val="163"/>
   </w:num>
   <w:num w:numId="104" w16cid:durableId="216666700">
-    <w:abstractNumId w:val="122"/>
+    <w:abstractNumId w:val="125"/>
   </w:num>
   <w:num w:numId="105" w16cid:durableId="109128233">
     <w:abstractNumId w:val="34"/>
@@ -27020,40 +28326,40 @@
     <w:abstractNumId w:val="58"/>
   </w:num>
   <w:num w:numId="110" w16cid:durableId="954218831">
-    <w:abstractNumId w:val="110"/>
+    <w:abstractNumId w:val="113"/>
   </w:num>
   <w:num w:numId="111" w16cid:durableId="904101517">
-    <w:abstractNumId w:val="125"/>
+    <w:abstractNumId w:val="128"/>
   </w:num>
   <w:num w:numId="112" w16cid:durableId="1253317046">
     <w:abstractNumId w:val="88"/>
   </w:num>
   <w:num w:numId="113" w16cid:durableId="1813325584">
-    <w:abstractNumId w:val="120"/>
+    <w:abstractNumId w:val="123"/>
   </w:num>
   <w:num w:numId="114" w16cid:durableId="508369199">
-    <w:abstractNumId w:val="143"/>
+    <w:abstractNumId w:val="146"/>
   </w:num>
   <w:num w:numId="115" w16cid:durableId="755593366">
-    <w:abstractNumId w:val="131"/>
+    <w:abstractNumId w:val="134"/>
   </w:num>
   <w:num w:numId="116" w16cid:durableId="526723045">
-    <w:abstractNumId w:val="141"/>
+    <w:abstractNumId w:val="144"/>
   </w:num>
   <w:num w:numId="117" w16cid:durableId="1515725074">
     <w:abstractNumId w:val="61"/>
   </w:num>
   <w:num w:numId="118" w16cid:durableId="1472013178">
-    <w:abstractNumId w:val="146"/>
+    <w:abstractNumId w:val="149"/>
   </w:num>
   <w:num w:numId="119" w16cid:durableId="348145094">
-    <w:abstractNumId w:val="158"/>
+    <w:abstractNumId w:val="161"/>
   </w:num>
   <w:num w:numId="120" w16cid:durableId="1487549432">
     <w:abstractNumId w:val="25"/>
   </w:num>
   <w:num w:numId="121" w16cid:durableId="781846308">
-    <w:abstractNumId w:val="163"/>
+    <w:abstractNumId w:val="167"/>
   </w:num>
   <w:num w:numId="122" w16cid:durableId="1928462526">
     <w:abstractNumId w:val="28"/>
@@ -27117,19 +28423,19 @@
     <w:abstractNumId w:val="15"/>
   </w:num>
   <w:num w:numId="131" w16cid:durableId="305207024">
-    <w:abstractNumId w:val="174"/>
+    <w:abstractNumId w:val="178"/>
   </w:num>
   <w:num w:numId="132" w16cid:durableId="303120880">
     <w:abstractNumId w:val="51"/>
   </w:num>
   <w:num w:numId="133" w16cid:durableId="926383284">
-    <w:abstractNumId w:val="145"/>
+    <w:abstractNumId w:val="148"/>
   </w:num>
   <w:num w:numId="134" w16cid:durableId="1977298208">
-    <w:abstractNumId w:val="104"/>
+    <w:abstractNumId w:val="107"/>
   </w:num>
   <w:num w:numId="135" w16cid:durableId="1556696686">
-    <w:abstractNumId w:val="112"/>
+    <w:abstractNumId w:val="115"/>
   </w:num>
   <w:num w:numId="136" w16cid:durableId="11954707">
     <w:abstractNumId w:val="13"/>
@@ -27141,16 +28447,16 @@
     <w:abstractNumId w:val="86"/>
   </w:num>
   <w:num w:numId="139" w16cid:durableId="1501693897">
-    <w:abstractNumId w:val="117"/>
+    <w:abstractNumId w:val="120"/>
   </w:num>
   <w:num w:numId="140" w16cid:durableId="917518012">
-    <w:abstractNumId w:val="133"/>
+    <w:abstractNumId w:val="136"/>
   </w:num>
   <w:num w:numId="141" w16cid:durableId="1124225954">
-    <w:abstractNumId w:val="172"/>
+    <w:abstractNumId w:val="176"/>
   </w:num>
   <w:num w:numId="142" w16cid:durableId="1428883756">
-    <w:abstractNumId w:val="139"/>
+    <w:abstractNumId w:val="142"/>
   </w:num>
   <w:num w:numId="143" w16cid:durableId="1651326372">
     <w:abstractNumId w:val="44"/>
@@ -27159,13 +28465,13 @@
     <w:abstractNumId w:val="19"/>
   </w:num>
   <w:num w:numId="145" w16cid:durableId="592209289">
-    <w:abstractNumId w:val="149"/>
+    <w:abstractNumId w:val="152"/>
   </w:num>
   <w:num w:numId="146" w16cid:durableId="397285438">
     <w:abstractNumId w:val="53"/>
   </w:num>
   <w:num w:numId="147" w16cid:durableId="81950788">
-    <w:abstractNumId w:val="100"/>
+    <w:abstractNumId w:val="102"/>
   </w:num>
   <w:num w:numId="148" w16cid:durableId="1868786268">
     <w:abstractNumId w:val="2"/>
@@ -27177,10 +28483,10 @@
     <w:abstractNumId w:val="0"/>
   </w:num>
   <w:num w:numId="151" w16cid:durableId="1123428036">
-    <w:abstractNumId w:val="132"/>
+    <w:abstractNumId w:val="135"/>
   </w:num>
   <w:num w:numId="152" w16cid:durableId="991253855">
-    <w:abstractNumId w:val="132"/>
+    <w:abstractNumId w:val="135"/>
     <w:lvlOverride w:ilvl="1">
       <w:startOverride w:val="1"/>
     </w:lvlOverride>
@@ -27192,13 +28498,13 @@
     <w:abstractNumId w:val="80"/>
   </w:num>
   <w:num w:numId="155" w16cid:durableId="292488364">
-    <w:abstractNumId w:val="137"/>
+    <w:abstractNumId w:val="140"/>
   </w:num>
   <w:num w:numId="156" w16cid:durableId="1886066264">
-    <w:abstractNumId w:val="142"/>
+    <w:abstractNumId w:val="145"/>
   </w:num>
   <w:num w:numId="157" w16cid:durableId="2038193403">
-    <w:abstractNumId w:val="142"/>
+    <w:abstractNumId w:val="145"/>
     <w:lvlOverride w:ilvl="1">
       <w:lvl w:ilvl="1">
         <w:numFmt w:val="bullet"/>
@@ -27221,16 +28527,16 @@
     <w:abstractNumId w:val="24"/>
   </w:num>
   <w:num w:numId="159" w16cid:durableId="915242249">
-    <w:abstractNumId w:val="99"/>
+    <w:abstractNumId w:val="101"/>
   </w:num>
   <w:num w:numId="160" w16cid:durableId="2058815222">
     <w:abstractNumId w:val="10"/>
   </w:num>
   <w:num w:numId="161" w16cid:durableId="1672024289">
-    <w:abstractNumId w:val="109"/>
+    <w:abstractNumId w:val="112"/>
   </w:num>
   <w:num w:numId="162" w16cid:durableId="968634561">
-    <w:abstractNumId w:val="109"/>
+    <w:abstractNumId w:val="112"/>
     <w:lvlOverride w:ilvl="1">
       <w:lvl w:ilvl="1">
         <w:numFmt w:val="bullet"/>
@@ -27253,7 +28559,7 @@
     <w:abstractNumId w:val="36"/>
   </w:num>
   <w:num w:numId="164" w16cid:durableId="346951097">
-    <w:abstractNumId w:val="118"/>
+    <w:abstractNumId w:val="121"/>
   </w:num>
   <w:num w:numId="165" w16cid:durableId="786855938">
     <w:abstractNumId w:val="45"/>
@@ -27271,7 +28577,7 @@
     <w:abstractNumId w:val="54"/>
   </w:num>
   <w:num w:numId="169" w16cid:durableId="675571960">
-    <w:abstractNumId w:val="95"/>
+    <w:abstractNumId w:val="96"/>
   </w:num>
   <w:num w:numId="170" w16cid:durableId="461383622">
     <w:abstractNumId w:val="75"/>
@@ -27280,7 +28586,7 @@
     <w:abstractNumId w:val="43"/>
   </w:num>
   <w:num w:numId="172" w16cid:durableId="1425685518">
-    <w:abstractNumId w:val="153"/>
+    <w:abstractNumId w:val="156"/>
   </w:num>
   <w:num w:numId="173" w16cid:durableId="536354307">
     <w:abstractNumId w:val="59"/>
@@ -27289,19 +28595,19 @@
     <w:abstractNumId w:val="30"/>
   </w:num>
   <w:num w:numId="175" w16cid:durableId="875001005">
-    <w:abstractNumId w:val="161"/>
+    <w:abstractNumId w:val="165"/>
   </w:num>
   <w:num w:numId="176" w16cid:durableId="552930650">
-    <w:abstractNumId w:val="126"/>
+    <w:abstractNumId w:val="129"/>
   </w:num>
   <w:num w:numId="177" w16cid:durableId="649478602">
-    <w:abstractNumId w:val="162"/>
+    <w:abstractNumId w:val="166"/>
   </w:num>
   <w:num w:numId="178" w16cid:durableId="1615282566">
     <w:abstractNumId w:val="37"/>
   </w:num>
   <w:num w:numId="179" w16cid:durableId="1783767042">
-    <w:abstractNumId w:val="168"/>
+    <w:abstractNumId w:val="172"/>
   </w:num>
   <w:num w:numId="180" w16cid:durableId="742531134">
     <w:abstractNumId w:val="31"/>
@@ -27313,7 +28619,7 @@
     <w:abstractNumId w:val="8"/>
   </w:num>
   <w:num w:numId="183" w16cid:durableId="1773165063">
-    <w:abstractNumId w:val="124"/>
+    <w:abstractNumId w:val="127"/>
   </w:num>
   <w:num w:numId="184" w16cid:durableId="1007832891">
     <w:abstractNumId w:val="7"/>
@@ -27322,10 +28628,10 @@
     <w:abstractNumId w:val="90"/>
   </w:num>
   <w:num w:numId="186" w16cid:durableId="44915836">
-    <w:abstractNumId w:val="167"/>
+    <w:abstractNumId w:val="171"/>
   </w:num>
   <w:num w:numId="187" w16cid:durableId="833184744">
-    <w:abstractNumId w:val="111"/>
+    <w:abstractNumId w:val="114"/>
   </w:num>
   <w:num w:numId="188" w16cid:durableId="1715157717">
     <w:abstractNumId w:val="11"/>
@@ -27334,19 +28640,31 @@
     <w:abstractNumId w:val="81"/>
   </w:num>
   <w:num w:numId="190" w16cid:durableId="271665483">
-    <w:abstractNumId w:val="171"/>
+    <w:abstractNumId w:val="175"/>
   </w:num>
   <w:num w:numId="191" w16cid:durableId="1269580070">
-    <w:abstractNumId w:val="116"/>
+    <w:abstractNumId w:val="119"/>
   </w:num>
   <w:num w:numId="192" w16cid:durableId="1842308085">
     <w:abstractNumId w:val="20"/>
   </w:num>
   <w:num w:numId="193" w16cid:durableId="399522766">
-    <w:abstractNumId w:val="166"/>
+    <w:abstractNumId w:val="170"/>
   </w:num>
   <w:num w:numId="194" w16cid:durableId="1172987669">
-    <w:abstractNumId w:val="170"/>
+    <w:abstractNumId w:val="174"/>
+  </w:num>
+  <w:num w:numId="195" w16cid:durableId="156726155">
+    <w:abstractNumId w:val="95"/>
+  </w:num>
+  <w:num w:numId="196" w16cid:durableId="1764834616">
+    <w:abstractNumId w:val="162"/>
+  </w:num>
+  <w:num w:numId="197" w16cid:durableId="1084379346">
+    <w:abstractNumId w:val="100"/>
+  </w:num>
+  <w:num w:numId="198" w16cid:durableId="1652783708">
+    <w:abstractNumId w:val="105"/>
   </w:num>
 </w:numbering>
 </file>
@@ -27974,6 +29292,7 @@
   <w:style w:type="character" w:default="1" w:styleId="Policepardfaut">
     <w:name w:val="Default Paragraph Font"/>
     <w:uiPriority w:val="1"/>
+    <w:semiHidden/>
     <w:unhideWhenUsed/>
   </w:style>
   <w:style w:type="table" w:default="1" w:styleId="TableauNormal">

</xml_diff>